<commit_message>
Bai Bicycle Store voi css, FlatList, Switch, Filter, Navigate
</commit_message>
<xml_diff>
--- a/NoteOnThi.docx
+++ b/NoteOnThi.docx
@@ -45,11 +45,73 @@
       </w:r>
     </w:p>
     <w:p>
-      <w:r>
+      <w:pPr>
+        <w:pStyle w:val="HTMLPreformatted"/>
+        <w:wordWrap w:val="0"/>
+        <w:spacing w:line="330" w:lineRule="atLeast"/>
+        <w:rPr>
+          <w:rFonts w:ascii="Consolas" w:hAnsi="Consolas"/>
+          <w:color w:val="F9FAFB"/>
+        </w:rPr>
+      </w:pPr>
+      <w:r>
+        <w:rPr>
+          <w:lang w:val="vi-VN"/>
+        </w:rPr>
+        <w:t xml:space="preserve">Css ảnh ko bị cắt : </w:t>
+      </w:r>
+      <w:r>
+        <w:rPr>
+          <w:rFonts w:ascii="Consolas" w:hAnsi="Consolas"/>
+          <w:color w:val="6CB8E6"/>
+        </w:rPr>
+        <w:t>resizeMode</w:t>
+      </w:r>
+      <w:r>
+        <w:rPr>
+          <w:rFonts w:ascii="Consolas" w:hAnsi="Consolas"/>
+          <w:color w:val="E9AE7E"/>
+        </w:rPr>
+        <w:t>:</w:t>
+      </w:r>
+      <w:r>
+        <w:rPr>
+          <w:rFonts w:ascii="Consolas" w:hAnsi="Consolas"/>
+          <w:color w:val="F9FAFB"/>
+        </w:rPr>
+        <w:t xml:space="preserve"> </w:t>
+      </w:r>
+      <w:r>
+        <w:rPr>
+          <w:rFonts w:ascii="Consolas" w:hAnsi="Consolas"/>
+          <w:color w:val="91D076"/>
+        </w:rPr>
+        <w:t>"contain"</w:t>
+      </w:r>
+      <w:r>
+        <w:rPr>
+          <w:rFonts w:ascii="Consolas" w:hAnsi="Consolas"/>
+          <w:color w:val="E3EAF2"/>
+        </w:rPr>
+        <w:t>,</w:t>
+      </w:r>
+    </w:p>
+    <w:p>
+      <w:pPr>
+        <w:rPr>
+          <w:lang w:val="vi-VN"/>
+        </w:rPr>
+      </w:pPr>
+    </w:p>
+    <w:p>
+      <w:r>
+        <w:rPr>
+          <w:noProof/>
+        </w:rPr>
         <w:drawing>
           <wp:inline distT="0" distB="0" distL="0" distR="0" wp14:anchorId="4220671C" wp14:editId="27BF0EA9">
-            <wp:extent cx="5943600" cy="4036060"/>
-            <wp:effectExtent l="0" t="0" r="0" b="2540"/>
+            <wp:extent cx="5943600" cy="3625886"/>
+            <wp:effectExtent l="0" t="0" r="0" b="0"/>
             <wp:docPr id="2" name="Picture 2"/>
             <wp:cNvGraphicFramePr>
               <a:graphicFrameLocks xmlns:a="http://schemas.openxmlformats.org/drawingml/2006/main" noChangeAspect="1"/>
@@ -70,7 +132,7 @@
                   <pic:spPr>
                     <a:xfrm>
                       <a:off x="0" y="0"/>
-                      <a:ext cx="5943600" cy="4036060"/>
+                      <a:ext cx="5948396" cy="3628812"/>
                     </a:xfrm>
                     <a:prstGeom prst="rect">
                       <a:avLst/>
@@ -85,6 +147,176 @@
     </w:p>
     <w:p>
       <w:pPr>
+        <w:rPr>
+          <w:lang w:val="vi-VN"/>
+        </w:rPr>
+      </w:pPr>
+      <w:r>
+        <w:rPr>
+          <w:lang w:val="vi-VN"/>
+        </w:rPr>
+        <w:t>Dùng Switch để đổi loại cột phải nhớ thêm KEY ko là bị lỗi</w:t>
+      </w:r>
+    </w:p>
+    <w:p>
+      <w:r>
+        <w:drawing>
+          <wp:inline distT="0" distB="0" distL="0" distR="0" wp14:anchorId="7CAAB060" wp14:editId="6285E68A">
+            <wp:extent cx="5943600" cy="716915"/>
+            <wp:effectExtent l="0" t="0" r="0" b="6985"/>
+            <wp:docPr id="3" name="Picture 3"/>
+            <wp:cNvGraphicFramePr>
+              <a:graphicFrameLocks xmlns:a="http://schemas.openxmlformats.org/drawingml/2006/main" noChangeAspect="1"/>
+            </wp:cNvGraphicFramePr>
+            <a:graphic xmlns:a="http://schemas.openxmlformats.org/drawingml/2006/main">
+              <a:graphicData uri="http://schemas.openxmlformats.org/drawingml/2006/picture">
+                <pic:pic xmlns:pic="http://schemas.openxmlformats.org/drawingml/2006/picture">
+                  <pic:nvPicPr>
+                    <pic:cNvPr id="1" name=""/>
+                    <pic:cNvPicPr/>
+                  </pic:nvPicPr>
+                  <pic:blipFill>
+                    <a:blip r:embed="rId6"/>
+                    <a:stretch>
+                      <a:fillRect/>
+                    </a:stretch>
+                  </pic:blipFill>
+                  <pic:spPr>
+                    <a:xfrm>
+                      <a:off x="0" y="0"/>
+                      <a:ext cx="5943600" cy="716915"/>
+                    </a:xfrm>
+                    <a:prstGeom prst="rect">
+                      <a:avLst/>
+                    </a:prstGeom>
+                  </pic:spPr>
+                </pic:pic>
+              </a:graphicData>
+            </a:graphic>
+          </wp:inline>
+        </w:drawing>
+      </w:r>
+    </w:p>
+    <w:p/>
+    <w:p>
+      <w:pPr>
+        <w:rPr>
+          <w:lang w:val="vi-VN"/>
+        </w:rPr>
+      </w:pPr>
+      <w:r>
+        <w:rPr>
+          <w:lang w:val="vi-VN"/>
+        </w:rPr>
+        <w:lastRenderedPageBreak/>
+        <w:t xml:space="preserve">Css kết hợp inline với styleSheet phải cho vô mảng </w:t>
+      </w:r>
+    </w:p>
+    <w:p>
+      <w:pPr>
+        <w:rPr>
+          <w:lang w:val="vi-VN"/>
+        </w:rPr>
+      </w:pPr>
+      <w:r>
+        <w:rPr>
+          <w:lang w:val="vi-VN"/>
+        </w:rPr>
+        <w:drawing>
+          <wp:inline distT="0" distB="0" distL="0" distR="0" wp14:anchorId="2843F9B1" wp14:editId="40CA6C1B">
+            <wp:extent cx="5943600" cy="170180"/>
+            <wp:effectExtent l="0" t="0" r="0" b="1270"/>
+            <wp:docPr id="4" name="Picture 4"/>
+            <wp:cNvGraphicFramePr>
+              <a:graphicFrameLocks xmlns:a="http://schemas.openxmlformats.org/drawingml/2006/main" noChangeAspect="1"/>
+            </wp:cNvGraphicFramePr>
+            <a:graphic xmlns:a="http://schemas.openxmlformats.org/drawingml/2006/main">
+              <a:graphicData uri="http://schemas.openxmlformats.org/drawingml/2006/picture">
+                <pic:pic xmlns:pic="http://schemas.openxmlformats.org/drawingml/2006/picture">
+                  <pic:nvPicPr>
+                    <pic:cNvPr id="1" name=""/>
+                    <pic:cNvPicPr/>
+                  </pic:nvPicPr>
+                  <pic:blipFill>
+                    <a:blip r:embed="rId7"/>
+                    <a:stretch>
+                      <a:fillRect/>
+                    </a:stretch>
+                  </pic:blipFill>
+                  <pic:spPr>
+                    <a:xfrm>
+                      <a:off x="0" y="0"/>
+                      <a:ext cx="5943600" cy="170180"/>
+                    </a:xfrm>
+                    <a:prstGeom prst="rect">
+                      <a:avLst/>
+                    </a:prstGeom>
+                  </pic:spPr>
+                </pic:pic>
+              </a:graphicData>
+            </a:graphic>
+          </wp:inline>
+        </w:drawing>
+      </w:r>
+    </w:p>
+    <w:p>
+      <w:pPr>
+        <w:rPr>
+          <w:lang w:val="vi-VN"/>
+        </w:rPr>
+      </w:pPr>
+      <w:r>
+        <w:rPr>
+          <w:lang w:val="vi-VN"/>
+        </w:rPr>
+        <w:t>* CÓ thể lọc trong mảng bằng filter, rồi cho dsXeHT vô trong data của FlatList</w:t>
+      </w:r>
+      <w:bookmarkStart w:id="0" w:name="_GoBack"/>
+      <w:bookmarkEnd w:id="0"/>
+      <w:r>
+        <w:rPr>
+          <w:lang w:val="vi-VN"/>
+        </w:rPr>
+        <w:drawing>
+          <wp:inline distT="0" distB="0" distL="0" distR="0" wp14:anchorId="5701F5CD" wp14:editId="7FB28DD8">
+            <wp:extent cx="5819818" cy="762006"/>
+            <wp:effectExtent l="0" t="0" r="0" b="0"/>
+            <wp:docPr id="5" name="Picture 5"/>
+            <wp:cNvGraphicFramePr>
+              <a:graphicFrameLocks xmlns:a="http://schemas.openxmlformats.org/drawingml/2006/main" noChangeAspect="1"/>
+            </wp:cNvGraphicFramePr>
+            <a:graphic xmlns:a="http://schemas.openxmlformats.org/drawingml/2006/main">
+              <a:graphicData uri="http://schemas.openxmlformats.org/drawingml/2006/picture">
+                <pic:pic xmlns:pic="http://schemas.openxmlformats.org/drawingml/2006/picture">
+                  <pic:nvPicPr>
+                    <pic:cNvPr id="1" name=""/>
+                    <pic:cNvPicPr/>
+                  </pic:nvPicPr>
+                  <pic:blipFill>
+                    <a:blip r:embed="rId8"/>
+                    <a:stretch>
+                      <a:fillRect/>
+                    </a:stretch>
+                  </pic:blipFill>
+                  <pic:spPr>
+                    <a:xfrm>
+                      <a:off x="0" y="0"/>
+                      <a:ext cx="5819818" cy="762006"/>
+                    </a:xfrm>
+                    <a:prstGeom prst="rect">
+                      <a:avLst/>
+                    </a:prstGeom>
+                  </pic:spPr>
+                </pic:pic>
+              </a:graphicData>
+            </a:graphic>
+          </wp:inline>
+        </w:drawing>
+      </w:r>
+    </w:p>
+    <w:p/>
+    <w:p>
+      <w:pPr>
         <w:spacing w:before="100" w:beforeAutospacing="1" w:after="100" w:afterAutospacing="1" w:line="240" w:lineRule="auto"/>
         <w:outlineLvl w:val="0"/>
         <w:rPr>
@@ -139,6 +371,55 @@
     </w:p>
     <w:p>
       <w:pPr>
+        <w:shd w:val="clear" w:color="auto" w:fill="121314"/>
+        <w:spacing w:after="0" w:line="285" w:lineRule="atLeast"/>
+        <w:rPr>
+          <w:rFonts w:ascii="Consolas" w:eastAsia="Times New Roman" w:hAnsi="Consolas" w:cs="Times New Roman"/>
+          <w:color w:val="BBBEBF"/>
+          <w:sz w:val="21"/>
+          <w:szCs w:val="21"/>
+        </w:rPr>
+      </w:pPr>
+      <w:r>
+        <w:rPr>
+          <w:rFonts w:ascii="Consolas" w:eastAsia="Times New Roman" w:hAnsi="Consolas" w:cs="Times New Roman"/>
+          <w:color w:val="C9D1D9"/>
+          <w:sz w:val="21"/>
+          <w:szCs w:val="21"/>
+        </w:rPr>
+        <w:t>      textAlign</w:t>
+      </w:r>
+      <w:r>
+        <w:rPr>
+          <w:rFonts w:ascii="Consolas" w:eastAsia="Times New Roman" w:hAnsi="Consolas" w:cs="Times New Roman"/>
+          <w:color w:val="9CDCFE"/>
+          <w:sz w:val="21"/>
+          <w:szCs w:val="21"/>
+        </w:rPr>
+        <w:t>:</w:t>
+      </w:r>
+      <w:r>
+        <w:rPr>
+          <w:rFonts w:ascii="Consolas" w:eastAsia="Times New Roman" w:hAnsi="Consolas" w:cs="Times New Roman"/>
+          <w:color w:val="A5D6FF"/>
+          <w:sz w:val="21"/>
+          <w:szCs w:val="21"/>
+        </w:rPr>
+        <w:t>"center"</w:t>
+      </w:r>
+    </w:p>
+    <w:p>
+      <w:pPr>
+        <w:spacing w:before="100" w:beforeAutospacing="1" w:after="100" w:afterAutospacing="1" w:line="240" w:lineRule="auto"/>
+        <w:rPr>
+          <w:rFonts w:ascii="Times New Roman" w:eastAsia="Times New Roman" w:hAnsi="Times New Roman" w:cs="Times New Roman"/>
+          <w:sz w:val="24"/>
+          <w:szCs w:val="24"/>
+        </w:rPr>
+      </w:pPr>
+    </w:p>
+    <w:p>
+      <w:pPr>
         <w:spacing w:before="100" w:beforeAutospacing="1" w:after="100" w:afterAutospacing="1" w:line="240" w:lineRule="auto"/>
         <w:outlineLvl w:val="2"/>
         <w:rPr>
@@ -175,7 +456,6 @@
           <w:sz w:val="20"/>
           <w:szCs w:val="20"/>
         </w:rPr>
-        <w:lastRenderedPageBreak/>
         <w:t>View</w:t>
       </w:r>
       <w:r>
@@ -529,6 +809,7 @@
           <w:sz w:val="20"/>
           <w:szCs w:val="20"/>
         </w:rPr>
+        <w:lastRenderedPageBreak/>
         <w:t>center</w:t>
       </w:r>
     </w:p>
@@ -928,7 +1209,6 @@
           <w:sz w:val="27"/>
           <w:szCs w:val="27"/>
         </w:rPr>
-        <w:lastRenderedPageBreak/>
         <w:t>6. flexWrap</w:t>
       </w:r>
     </w:p>
@@ -1326,6 +1606,7 @@
           <w:sz w:val="24"/>
           <w:szCs w:val="24"/>
         </w:rPr>
+        <w:lastRenderedPageBreak/>
         <w:pict>
           <v:rect id="_x0000_i1033" style="width:0;height:1.5pt" o:hralign="center" o:hrstd="t" o:hr="t" fillcolor="#a0a0a0" stroked="f"/>
         </w:pict>
@@ -1718,7 +1999,6 @@
           <w:sz w:val="24"/>
           <w:szCs w:val="24"/>
         </w:rPr>
-        <w:lastRenderedPageBreak/>
         <w:t xml:space="preserve">Giúp nội dung nằm trong </w:t>
       </w:r>
       <w:r>
@@ -2183,6 +2463,7 @@
           <w:sz w:val="20"/>
           <w:szCs w:val="20"/>
         </w:rPr>
+        <w:lastRenderedPageBreak/>
         <w:t>flexDirection: 'row'</w:t>
       </w:r>
     </w:p>
@@ -2487,7 +2768,6 @@
           <w:sz w:val="48"/>
           <w:szCs w:val="48"/>
         </w:rPr>
-        <w:lastRenderedPageBreak/>
         <w:t>🧠 Công thức nhớ nhanh khi làm UI</w:t>
       </w:r>
     </w:p>
@@ -2842,6 +3122,7 @@
           <w:sz w:val="24"/>
           <w:szCs w:val="24"/>
         </w:rPr>
+        <w:lastRenderedPageBreak/>
         <w:t>Tạo khoảng cách</w:t>
       </w:r>
     </w:p>
@@ -3266,7 +3547,6 @@
           <w:sz w:val="24"/>
           <w:szCs w:val="24"/>
         </w:rPr>
-        <w:lastRenderedPageBreak/>
         <w:t>Tránh tai thỏ</w:t>
       </w:r>
     </w:p>
@@ -3362,10 +3642,7 @@
         <w:t>alignSelf</w:t>
       </w:r>
     </w:p>
-    <w:p>
-      <w:bookmarkStart w:id="0" w:name="_GoBack"/>
-      <w:bookmarkEnd w:id="0"/>
-    </w:p>
+    <w:p/>
     <w:sectPr>
       <w:pgSz w:w="12240" w:h="15840"/>
       <w:pgMar w:top="1440" w:right="1440" w:bottom="1440" w:left="1440" w:header="720" w:footer="720" w:gutter="0"/>
@@ -3978,6 +4255,11 @@
     <w:basedOn w:val="DefaultParagraphFont"/>
     <w:rsid w:val="00B607E0"/>
   </w:style>
+  <w:style w:type="character" w:customStyle="1" w:styleId="token">
+    <w:name w:val="token"/>
+    <w:basedOn w:val="DefaultParagraphFont"/>
+    <w:rsid w:val="007179EF"/>
+  </w:style>
 </w:styles>
 </file>
 

</xml_diff>

<commit_message>
Cac bai movie tu lam, P3 la ket hop them nav
</commit_message>
<xml_diff>
--- a/NoteOnThi.docx
+++ b/NoteOnThi.docx
@@ -3,116 +3,28 @@
 <w:document xmlns:wpc="http://schemas.microsoft.com/office/word/2010/wordprocessingCanvas" xmlns:cx="http://schemas.microsoft.com/office/drawing/2014/chartex" xmlns:mc="http://schemas.openxmlformats.org/markup-compatibility/2006" xmlns:o="urn:schemas-microsoft-com:office:office" xmlns:r="http://schemas.openxmlformats.org/officeDocument/2006/relationships" xmlns:m="http://schemas.openxmlformats.org/officeDocument/2006/math" xmlns:v="urn:schemas-microsoft-com:vml" xmlns:wp14="http://schemas.microsoft.com/office/word/2010/wordprocessingDrawing" xmlns:wp="http://schemas.openxmlformats.org/drawingml/2006/wordprocessingDrawing" xmlns:w10="urn:schemas-microsoft-com:office:word" xmlns:w="http://schemas.openxmlformats.org/wordprocessingml/2006/main" xmlns:w14="http://schemas.microsoft.com/office/word/2010/wordml" xmlns:w15="http://schemas.microsoft.com/office/word/2012/wordml" xmlns:w16se="http://schemas.microsoft.com/office/word/2015/wordml/symex" xmlns:wpg="http://schemas.microsoft.com/office/word/2010/wordprocessingGroup" xmlns:wpi="http://schemas.microsoft.com/office/word/2010/wordprocessingInk" xmlns:wne="http://schemas.microsoft.com/office/word/2006/wordml" xmlns:wps="http://schemas.microsoft.com/office/word/2010/wordprocessingShape" mc:Ignorable="w14 w15 w16se wp14">
   <w:body>
     <w:p>
-      <w:r>
-        <w:rPr>
-          <w:noProof/>
+      <w:pPr>
+        <w:rPr>
+          <w:rFonts w:ascii="Consolas" w:hAnsi="Consolas"/>
+          <w:color w:val="F9FAFB"/>
+          <w:sz w:val="20"/>
+          <w:szCs w:val="20"/>
+          <w:shd w:val="clear" w:color="auto" w:fill="2C2C2E"/>
+        </w:rPr>
+      </w:pPr>
+      <w:r>
+        <w:rPr>
+          <w:rFonts w:ascii="Consolas" w:hAnsi="Consolas"/>
+          <w:color w:val="F9FAFB"/>
+          <w:sz w:val="20"/>
+          <w:szCs w:val="20"/>
+          <w:shd w:val="clear" w:color="auto" w:fill="2C2C2E"/>
         </w:rPr>
         <w:drawing>
-          <wp:inline distT="0" distB="0" distL="0" distR="0" wp14:anchorId="4A21CE07" wp14:editId="65F915EB">
-            <wp:extent cx="5943600" cy="2532380"/>
-            <wp:effectExtent l="0" t="0" r="0" b="1270"/>
-            <wp:docPr id="1" name="Picture 1"/>
-            <wp:cNvGraphicFramePr>
-              <a:graphicFrameLocks xmlns:a="http://schemas.openxmlformats.org/drawingml/2006/main" noChangeAspect="1"/>
-            </wp:cNvGraphicFramePr>
-            <a:graphic xmlns:a="http://schemas.openxmlformats.org/drawingml/2006/main">
-              <a:graphicData uri="http://schemas.openxmlformats.org/drawingml/2006/picture">
-                <pic:pic xmlns:pic="http://schemas.openxmlformats.org/drawingml/2006/picture">
-                  <pic:nvPicPr>
-                    <pic:cNvPr id="1" name=""/>
-                    <pic:cNvPicPr/>
-                  </pic:nvPicPr>
-                  <pic:blipFill>
-                    <a:blip r:embed="rId4"/>
-                    <a:stretch>
-                      <a:fillRect/>
-                    </a:stretch>
-                  </pic:blipFill>
-                  <pic:spPr>
-                    <a:xfrm>
-                      <a:off x="0" y="0"/>
-                      <a:ext cx="5943600" cy="2532380"/>
-                    </a:xfrm>
-                    <a:prstGeom prst="rect">
-                      <a:avLst/>
-                    </a:prstGeom>
-                  </pic:spPr>
-                </pic:pic>
-              </a:graphicData>
-            </a:graphic>
-          </wp:inline>
-        </w:drawing>
-      </w:r>
-    </w:p>
-    <w:p>
-      <w:pPr>
-        <w:pStyle w:val="HTMLPreformatted"/>
-        <w:wordWrap w:val="0"/>
-        <w:spacing w:line="330" w:lineRule="atLeast"/>
-        <w:rPr>
-          <w:rFonts w:ascii="Consolas" w:hAnsi="Consolas"/>
-          <w:color w:val="F9FAFB"/>
-        </w:rPr>
-      </w:pPr>
-      <w:r>
-        <w:rPr>
-          <w:lang w:val="vi-VN"/>
-        </w:rPr>
-        <w:t xml:space="preserve">Css ảnh ko bị cắt : </w:t>
-      </w:r>
-      <w:r>
-        <w:rPr>
-          <w:rFonts w:ascii="Consolas" w:hAnsi="Consolas"/>
-          <w:color w:val="6CB8E6"/>
-        </w:rPr>
-        <w:t>resizeMode</w:t>
-      </w:r>
-      <w:r>
-        <w:rPr>
-          <w:rFonts w:ascii="Consolas" w:hAnsi="Consolas"/>
-          <w:color w:val="E9AE7E"/>
-        </w:rPr>
-        <w:t>:</w:t>
-      </w:r>
-      <w:r>
-        <w:rPr>
-          <w:rFonts w:ascii="Consolas" w:hAnsi="Consolas"/>
-          <w:color w:val="F9FAFB"/>
-        </w:rPr>
-        <w:t xml:space="preserve"> </w:t>
-      </w:r>
-      <w:r>
-        <w:rPr>
-          <w:rFonts w:ascii="Consolas" w:hAnsi="Consolas"/>
-          <w:color w:val="91D076"/>
-        </w:rPr>
-        <w:t>"contain"</w:t>
-      </w:r>
-      <w:r>
-        <w:rPr>
-          <w:rFonts w:ascii="Consolas" w:hAnsi="Consolas"/>
-          <w:color w:val="E3EAF2"/>
-        </w:rPr>
-        <w:t>,</w:t>
-      </w:r>
-    </w:p>
-    <w:p>
-      <w:pPr>
-        <w:rPr>
-          <w:lang w:val="vi-VN"/>
-        </w:rPr>
-      </w:pPr>
-    </w:p>
-    <w:p>
-      <w:r>
-        <w:rPr>
-          <w:noProof/>
-        </w:rPr>
-        <w:drawing>
-          <wp:inline distT="0" distB="0" distL="0" distR="0" wp14:anchorId="4220671C" wp14:editId="27BF0EA9">
-            <wp:extent cx="5943600" cy="3625886"/>
-            <wp:effectExtent l="0" t="0" r="0" b="0"/>
-            <wp:docPr id="2" name="Picture 2"/>
+          <wp:inline distT="0" distB="0" distL="0" distR="0" wp14:anchorId="53C89562" wp14:editId="285F8E2B">
+            <wp:extent cx="5943600" cy="2600960"/>
+            <wp:effectExtent l="0" t="0" r="0" b="8890"/>
+            <wp:docPr id="10" name="Picture 10"/>
             <wp:cNvGraphicFramePr>
               <a:graphicFrameLocks xmlns:a="http://schemas.openxmlformats.org/drawingml/2006/main" noChangeAspect="1"/>
             </wp:cNvGraphicFramePr>
@@ -132,7 +44,7 @@
                   <pic:spPr>
                     <a:xfrm>
                       <a:off x="0" y="0"/>
-                      <a:ext cx="5948396" cy="3628812"/>
+                      <a:ext cx="5943600" cy="2600960"/>
                     </a:xfrm>
                     <a:prstGeom prst="rect">
                       <a:avLst/>
@@ -147,24 +59,280 @@
     </w:p>
     <w:p>
       <w:pPr>
-        <w:rPr>
-          <w:lang w:val="vi-VN"/>
-        </w:rPr>
-      </w:pPr>
-      <w:r>
-        <w:rPr>
-          <w:lang w:val="vi-VN"/>
-        </w:rPr>
-        <w:t>Dùng Switch để đổi loại cột phải nhớ thêm KEY ko là bị lỗi</w:t>
-      </w:r>
-    </w:p>
-    <w:p>
-      <w:r>
+        <w:spacing w:before="100" w:beforeAutospacing="1" w:after="100" w:afterAutospacing="1" w:line="240" w:lineRule="auto"/>
+        <w:rPr>
+          <w:rFonts w:ascii="Times New Roman" w:eastAsia="Times New Roman" w:hAnsi="Times New Roman" w:cs="Times New Roman"/>
+          <w:sz w:val="24"/>
+          <w:szCs w:val="24"/>
+        </w:rPr>
+      </w:pPr>
+      <w:r>
+        <w:rPr>
+          <w:rFonts w:ascii="Times New Roman" w:eastAsia="Times New Roman" w:hAnsi="Times New Roman" w:cs="Times New Roman"/>
+          <w:sz w:val="24"/>
+          <w:szCs w:val="24"/>
+        </w:rPr>
+        <w:t>Theo thông báo của bạn:</w:t>
+      </w:r>
+    </w:p>
+    <w:p>
+      <w:pPr>
+        <w:numPr>
+          <w:ilvl w:val="0"/>
+          <w:numId w:val="1"/>
+        </w:numPr>
+        <w:spacing w:before="100" w:beforeAutospacing="1" w:after="100" w:afterAutospacing="1" w:line="240" w:lineRule="auto"/>
+        <w:rPr>
+          <w:rFonts w:ascii="Times New Roman" w:eastAsia="Times New Roman" w:hAnsi="Times New Roman" w:cs="Times New Roman"/>
+          <w:sz w:val="24"/>
+          <w:szCs w:val="24"/>
+        </w:rPr>
+      </w:pPr>
+      <w:r>
+        <w:rPr>
+          <w:rFonts w:ascii="Times New Roman" w:eastAsia="Times New Roman" w:hAnsi="Times New Roman" w:cs="Times New Roman"/>
+          <w:sz w:val="24"/>
+          <w:szCs w:val="24"/>
+        </w:rPr>
+        <w:t xml:space="preserve">Project đang dùng </w:t>
+      </w:r>
+      <w:r>
+        <w:rPr>
+          <w:rFonts w:ascii="Courier New" w:eastAsia="Times New Roman" w:hAnsi="Courier New" w:cs="Courier New"/>
+          <w:sz w:val="20"/>
+          <w:szCs w:val="20"/>
+        </w:rPr>
+        <w:t>react@19.2.3</w:t>
+      </w:r>
+      <w:r>
+        <w:rPr>
+          <w:rFonts w:ascii="Times New Roman" w:eastAsia="Times New Roman" w:hAnsi="Times New Roman" w:cs="Times New Roman"/>
+          <w:sz w:val="24"/>
+          <w:szCs w:val="24"/>
+        </w:rPr>
+        <w:t>.</w:t>
+      </w:r>
+    </w:p>
+    <w:p>
+      <w:pPr>
+        <w:numPr>
+          <w:ilvl w:val="0"/>
+          <w:numId w:val="1"/>
+        </w:numPr>
+        <w:spacing w:before="100" w:beforeAutospacing="1" w:after="100" w:afterAutospacing="1" w:line="240" w:lineRule="auto"/>
+        <w:rPr>
+          <w:rFonts w:ascii="Times New Roman" w:eastAsia="Times New Roman" w:hAnsi="Times New Roman" w:cs="Times New Roman"/>
+          <w:sz w:val="24"/>
+          <w:szCs w:val="24"/>
+        </w:rPr>
+      </w:pPr>
+      <w:r>
+        <w:rPr>
+          <w:rFonts w:ascii="Times New Roman" w:eastAsia="Times New Roman" w:hAnsi="Times New Roman" w:cs="Times New Roman"/>
+          <w:sz w:val="24"/>
+          <w:szCs w:val="24"/>
+        </w:rPr>
+        <w:t xml:space="preserve">npm lại chọn </w:t>
+      </w:r>
+      <w:r>
+        <w:rPr>
+          <w:rFonts w:ascii="Courier New" w:eastAsia="Times New Roman" w:hAnsi="Courier New" w:cs="Courier New"/>
+          <w:sz w:val="20"/>
+          <w:szCs w:val="20"/>
+        </w:rPr>
+        <w:t>react-test-renderer@19.3.0</w:t>
+      </w:r>
+      <w:r>
+        <w:rPr>
+          <w:rFonts w:ascii="Times New Roman" w:eastAsia="Times New Roman" w:hAnsi="Times New Roman" w:cs="Times New Roman"/>
+          <w:sz w:val="24"/>
+          <w:szCs w:val="24"/>
+        </w:rPr>
+        <w:t xml:space="preserve">, yêu cầu React </w:t>
+      </w:r>
+      <w:r>
+        <w:rPr>
+          <w:rFonts w:ascii="Courier New" w:eastAsia="Times New Roman" w:hAnsi="Courier New" w:cs="Courier New"/>
+          <w:sz w:val="20"/>
+          <w:szCs w:val="20"/>
+        </w:rPr>
+        <w:t>^19.3.0</w:t>
+      </w:r>
+      <w:r>
+        <w:rPr>
+          <w:rFonts w:ascii="Times New Roman" w:eastAsia="Times New Roman" w:hAnsi="Times New Roman" w:cs="Times New Roman"/>
+          <w:sz w:val="24"/>
+          <w:szCs w:val="24"/>
+        </w:rPr>
+        <w:t>.</w:t>
+      </w:r>
+    </w:p>
+    <w:p>
+      <w:pPr>
+        <w:numPr>
+          <w:ilvl w:val="0"/>
+          <w:numId w:val="1"/>
+        </w:numPr>
+        <w:spacing w:before="100" w:beforeAutospacing="1" w:after="100" w:afterAutospacing="1" w:line="240" w:lineRule="auto"/>
+        <w:rPr>
+          <w:rFonts w:ascii="Times New Roman" w:eastAsia="Times New Roman" w:hAnsi="Times New Roman" w:cs="Times New Roman"/>
+          <w:sz w:val="24"/>
+          <w:szCs w:val="24"/>
+        </w:rPr>
+      </w:pPr>
+      <w:r>
+        <w:rPr>
+          <w:rFonts w:ascii="Times New Roman" w:eastAsia="Times New Roman" w:hAnsi="Times New Roman" w:cs="Times New Roman"/>
+          <w:sz w:val="24"/>
+          <w:szCs w:val="24"/>
+        </w:rPr>
+        <w:t>Hai phiên bản này không khớp nên npm dừng cài đặt.</w:t>
+      </w:r>
+    </w:p>
+    <w:p>
+      <w:pPr>
+        <w:spacing w:before="100" w:beforeAutospacing="1" w:after="100" w:afterAutospacing="1" w:line="240" w:lineRule="auto"/>
+        <w:rPr>
+          <w:rFonts w:ascii="Times New Roman" w:eastAsia="Times New Roman" w:hAnsi="Times New Roman" w:cs="Times New Roman"/>
+          <w:sz w:val="24"/>
+          <w:szCs w:val="24"/>
+        </w:rPr>
+      </w:pPr>
+      <w:r>
+        <w:rPr>
+          <w:rFonts w:ascii="Times New Roman" w:eastAsia="Times New Roman" w:hAnsi="Times New Roman" w:cs="Times New Roman"/>
+          <w:sz w:val="24"/>
+          <w:szCs w:val="24"/>
+        </w:rPr>
+        <w:t xml:space="preserve">Không nên dùng </w:t>
+      </w:r>
+      <w:r>
+        <w:rPr>
+          <w:rFonts w:ascii="Courier New" w:eastAsia="Times New Roman" w:hAnsi="Courier New" w:cs="Courier New"/>
+          <w:sz w:val="20"/>
+          <w:szCs w:val="20"/>
+        </w:rPr>
+        <w:t>--force</w:t>
+      </w:r>
+      <w:r>
+        <w:rPr>
+          <w:rFonts w:ascii="Times New Roman" w:eastAsia="Times New Roman" w:hAnsi="Times New Roman" w:cs="Times New Roman"/>
+          <w:sz w:val="24"/>
+          <w:szCs w:val="24"/>
+        </w:rPr>
+        <w:t xml:space="preserve"> ngay, vì có thể khiến các thư viện không tương thích với nhau. Mình sẽ hướng dẫn bạn ghép đúng phiên bản trước.</w:t>
+      </w:r>
+    </w:p>
+    <w:p>
+      <w:pPr>
+        <w:spacing w:before="100" w:beforeAutospacing="1" w:after="100" w:afterAutospacing="1" w:line="240" w:lineRule="auto"/>
+        <w:outlineLvl w:val="2"/>
+        <w:rPr>
+          <w:rFonts w:ascii="Times New Roman" w:eastAsia="Times New Roman" w:hAnsi="Times New Roman" w:cs="Times New Roman"/>
+          <w:b/>
+          <w:bCs/>
+          <w:sz w:val="27"/>
+          <w:szCs w:val="27"/>
+        </w:rPr>
+      </w:pPr>
+      <w:r>
+        <w:rPr>
+          <w:rFonts w:ascii="Times New Roman" w:eastAsia="Times New Roman" w:hAnsi="Times New Roman" w:cs="Times New Roman"/>
+          <w:b/>
+          <w:bCs/>
+          <w:sz w:val="27"/>
+          <w:szCs w:val="27"/>
+        </w:rPr>
+        <w:t>Bước 1: Cài phiên bản tương thích</w:t>
+      </w:r>
+    </w:p>
+    <w:p>
+      <w:pPr>
+        <w:spacing w:before="100" w:beforeAutospacing="1" w:after="100" w:afterAutospacing="1" w:line="240" w:lineRule="auto"/>
+        <w:rPr>
+          <w:rFonts w:ascii="Times New Roman" w:eastAsia="Times New Roman" w:hAnsi="Times New Roman" w:cs="Times New Roman"/>
+          <w:sz w:val="24"/>
+          <w:szCs w:val="24"/>
+        </w:rPr>
+      </w:pPr>
+      <w:r>
+        <w:rPr>
+          <w:rFonts w:ascii="Times New Roman" w:eastAsia="Times New Roman" w:hAnsi="Times New Roman" w:cs="Times New Roman"/>
+          <w:sz w:val="24"/>
+          <w:szCs w:val="24"/>
+        </w:rPr>
+        <w:t xml:space="preserve">Expo SDK 57 dùng React </w:t>
+      </w:r>
+      <w:r>
+        <w:rPr>
+          <w:rFonts w:ascii="Courier New" w:eastAsia="Times New Roman" w:hAnsi="Courier New" w:cs="Courier New"/>
+          <w:sz w:val="20"/>
+          <w:szCs w:val="20"/>
+        </w:rPr>
+        <w:t>19.2.3</w:t>
+      </w:r>
+      <w:r>
+        <w:rPr>
+          <w:rFonts w:ascii="Times New Roman" w:eastAsia="Times New Roman" w:hAnsi="Times New Roman" w:cs="Times New Roman"/>
+          <w:sz w:val="24"/>
+          <w:szCs w:val="24"/>
+        </w:rPr>
+        <w:t xml:space="preserve">. Ta cần giữ phiên bản React này và cài </w:t>
+      </w:r>
+      <w:r>
+        <w:rPr>
+          <w:rFonts w:ascii="Courier New" w:eastAsia="Times New Roman" w:hAnsi="Courier New" w:cs="Courier New"/>
+          <w:sz w:val="20"/>
+          <w:szCs w:val="20"/>
+        </w:rPr>
+        <w:t>react-test-renderer</w:t>
+      </w:r>
+      <w:r>
+        <w:rPr>
+          <w:rFonts w:ascii="Times New Roman" w:eastAsia="Times New Roman" w:hAnsi="Times New Roman" w:cs="Times New Roman"/>
+          <w:sz w:val="24"/>
+          <w:szCs w:val="24"/>
+        </w:rPr>
+        <w:t xml:space="preserve"> đúng phiên bản thay vì để npm tự chọn </w:t>
+      </w:r>
+      <w:r>
+        <w:rPr>
+          <w:rFonts w:ascii="Courier New" w:eastAsia="Times New Roman" w:hAnsi="Courier New" w:cs="Courier New"/>
+          <w:sz w:val="20"/>
+          <w:szCs w:val="20"/>
+        </w:rPr>
+        <w:t>19.3.0</w:t>
+      </w:r>
+      <w:r>
+        <w:rPr>
+          <w:rFonts w:ascii="Times New Roman" w:eastAsia="Times New Roman" w:hAnsi="Times New Roman" w:cs="Times New Roman"/>
+          <w:sz w:val="24"/>
+          <w:szCs w:val="24"/>
+        </w:rPr>
+        <w:t xml:space="preserve">. </w:t>
+      </w:r>
+    </w:p>
+    <w:p>
+      <w:pPr>
+        <w:spacing w:after="0" w:line="240" w:lineRule="auto"/>
+        <w:rPr>
+          <w:rFonts w:ascii="Times New Roman" w:eastAsia="Times New Roman" w:hAnsi="Times New Roman" w:cs="Times New Roman"/>
+          <w:sz w:val="24"/>
+          <w:szCs w:val="24"/>
+        </w:rPr>
+      </w:pPr>
+      <w:r>
+        <w:rPr>
+          <w:rFonts w:ascii="Times New Roman" w:eastAsia="Times New Roman" w:hAnsi="Times New Roman" w:cs="Times New Roman"/>
+          <w:noProof/>
+          <w:sz w:val="24"/>
+          <w:szCs w:val="24"/>
+        </w:rPr>
         <w:drawing>
-          <wp:inline distT="0" distB="0" distL="0" distR="0" wp14:anchorId="7CAAB060" wp14:editId="6285E68A">
-            <wp:extent cx="5943600" cy="716915"/>
-            <wp:effectExtent l="0" t="0" r="0" b="6985"/>
-            <wp:docPr id="3" name="Picture 3"/>
+          <wp:inline distT="0" distB="0" distL="0" distR="0">
+            <wp:extent cx="304800" cy="304800"/>
+            <wp:effectExtent l="0" t="0" r="0" b="0"/>
+            <wp:docPr id="11" name="Picture 11" descr="https://www.google.com/s2/favicons?domain=https://docs.expo.dev&amp;sz=32"/>
             <wp:cNvGraphicFramePr>
               <a:graphicFrameLocks xmlns:a="http://schemas.openxmlformats.org/drawingml/2006/main" noChangeAspect="1"/>
             </wp:cNvGraphicFramePr>
@@ -172,23 +340,36 @@
               <a:graphicData uri="http://schemas.openxmlformats.org/drawingml/2006/picture">
                 <pic:pic xmlns:pic="http://schemas.openxmlformats.org/drawingml/2006/picture">
                   <pic:nvPicPr>
-                    <pic:cNvPr id="1" name=""/>
-                    <pic:cNvPicPr/>
+                    <pic:cNvPr id="0" name="Picture 15" descr="https://www.google.com/s2/favicons?domain=https://docs.expo.dev&amp;sz=32"/>
+                    <pic:cNvPicPr>
+                      <a:picLocks noChangeAspect="1" noChangeArrowheads="1"/>
+                    </pic:cNvPicPr>
                   </pic:nvPicPr>
                   <pic:blipFill>
-                    <a:blip r:embed="rId6"/>
+                    <a:blip r:embed="rId6">
+                      <a:extLst>
+                        <a:ext uri="{28A0092B-C50C-407E-A947-70E740481C1C}">
+                          <a14:useLocalDpi xmlns:a14="http://schemas.microsoft.com/office/drawing/2010/main" val="0"/>
+                        </a:ext>
+                      </a:extLst>
+                    </a:blip>
+                    <a:srcRect/>
                     <a:stretch>
                       <a:fillRect/>
                     </a:stretch>
                   </pic:blipFill>
-                  <pic:spPr>
+                  <pic:spPr bwMode="auto">
                     <a:xfrm>
                       <a:off x="0" y="0"/>
-                      <a:ext cx="5943600" cy="716915"/>
+                      <a:ext cx="304800" cy="304800"/>
                     </a:xfrm>
                     <a:prstGeom prst="rect">
                       <a:avLst/>
                     </a:prstGeom>
+                    <a:noFill/>
+                    <a:ln>
+                      <a:noFill/>
+                    </a:ln>
                   </pic:spPr>
                 </pic:pic>
               </a:graphicData>
@@ -197,7 +378,319 @@
         </w:drawing>
       </w:r>
     </w:p>
-    <w:p/>
+    <w:p>
+      <w:pPr>
+        <w:spacing w:after="0" w:line="240" w:lineRule="auto"/>
+        <w:rPr>
+          <w:rFonts w:ascii="Times New Roman" w:eastAsia="Times New Roman" w:hAnsi="Times New Roman" w:cs="Times New Roman"/>
+          <w:sz w:val="24"/>
+          <w:szCs w:val="24"/>
+        </w:rPr>
+      </w:pPr>
+      <w:r>
+        <w:rPr>
+          <w:rFonts w:ascii="Times New Roman" w:eastAsia="Times New Roman" w:hAnsi="Times New Roman" w:cs="Times New Roman"/>
+          <w:sz w:val="24"/>
+          <w:szCs w:val="24"/>
+        </w:rPr>
+        <w:t>Expo documentation</w:t>
+      </w:r>
+    </w:p>
+    <w:p>
+      <w:pPr>
+        <w:spacing w:after="0" w:line="240" w:lineRule="auto"/>
+        <w:rPr>
+          <w:rFonts w:ascii="Times New Roman" w:eastAsia="Times New Roman" w:hAnsi="Times New Roman" w:cs="Times New Roman"/>
+          <w:sz w:val="24"/>
+          <w:szCs w:val="24"/>
+        </w:rPr>
+      </w:pPr>
+      <w:r>
+        <w:rPr>
+          <w:rFonts w:ascii="Times New Roman" w:eastAsia="Times New Roman" w:hAnsi="Times New Roman" w:cs="Times New Roman"/>
+          <w:sz w:val="24"/>
+          <w:szCs w:val="24"/>
+        </w:rPr>
+        <w:t>+1</w:t>
+      </w:r>
+    </w:p>
+    <w:p>
+      <w:pPr>
+        <w:spacing w:before="100" w:beforeAutospacing="1" w:after="100" w:afterAutospacing="1" w:line="240" w:lineRule="auto"/>
+        <w:rPr>
+          <w:rFonts w:ascii="Times New Roman" w:eastAsia="Times New Roman" w:hAnsi="Times New Roman" w:cs="Times New Roman"/>
+          <w:sz w:val="24"/>
+          <w:szCs w:val="24"/>
+        </w:rPr>
+      </w:pPr>
+      <w:r>
+        <w:rPr>
+          <w:rFonts w:ascii="Times New Roman" w:eastAsia="Times New Roman" w:hAnsi="Times New Roman" w:cs="Times New Roman"/>
+          <w:sz w:val="24"/>
+          <w:szCs w:val="24"/>
+        </w:rPr>
+        <w:t>Chạy lần lượt:</w:t>
+      </w:r>
+    </w:p>
+    <w:p>
+      <w:pPr>
+        <w:tabs>
+          <w:tab w:val="left" w:pos="916"/>
+          <w:tab w:val="left" w:pos="1832"/>
+          <w:tab w:val="left" w:pos="2748"/>
+          <w:tab w:val="left" w:pos="3664"/>
+          <w:tab w:val="left" w:pos="4580"/>
+          <w:tab w:val="left" w:pos="5496"/>
+          <w:tab w:val="left" w:pos="6412"/>
+          <w:tab w:val="left" w:pos="7328"/>
+          <w:tab w:val="left" w:pos="8244"/>
+          <w:tab w:val="left" w:pos="9160"/>
+          <w:tab w:val="left" w:pos="10076"/>
+          <w:tab w:val="left" w:pos="10992"/>
+          <w:tab w:val="left" w:pos="11908"/>
+          <w:tab w:val="left" w:pos="12824"/>
+          <w:tab w:val="left" w:pos="13740"/>
+          <w:tab w:val="left" w:pos="14656"/>
+        </w:tabs>
+        <w:spacing w:after="0" w:line="240" w:lineRule="auto"/>
+        <w:rPr>
+          <w:rFonts w:ascii="Courier New" w:eastAsia="Times New Roman" w:hAnsi="Courier New" w:cs="Courier New"/>
+          <w:sz w:val="20"/>
+          <w:szCs w:val="20"/>
+        </w:rPr>
+      </w:pPr>
+      <w:r>
+        <w:rPr>
+          <w:rFonts w:ascii="Courier New" w:eastAsia="Times New Roman" w:hAnsi="Courier New" w:cs="Courier New"/>
+          <w:sz w:val="20"/>
+          <w:szCs w:val="20"/>
+        </w:rPr>
+        <w:t>npm install --save-dev react-test-renderer@19.2.3 --legacy-peer-deps</w:t>
+      </w:r>
+    </w:p>
+    <w:p>
+      <w:pPr>
+        <w:spacing w:before="100" w:beforeAutospacing="1" w:after="100" w:afterAutospacing="1" w:line="240" w:lineRule="auto"/>
+        <w:rPr>
+          <w:rFonts w:ascii="Times New Roman" w:eastAsia="Times New Roman" w:hAnsi="Times New Roman" w:cs="Times New Roman"/>
+          <w:sz w:val="24"/>
+          <w:szCs w:val="24"/>
+        </w:rPr>
+      </w:pPr>
+      <w:r>
+        <w:rPr>
+          <w:rFonts w:ascii="Times New Roman" w:eastAsia="Times New Roman" w:hAnsi="Times New Roman" w:cs="Times New Roman"/>
+          <w:sz w:val="24"/>
+          <w:szCs w:val="24"/>
+        </w:rPr>
+        <w:t>Sau đó thử cài Jest và các thư viện còn lại:</w:t>
+      </w:r>
+    </w:p>
+    <w:p>
+      <w:pPr>
+        <w:tabs>
+          <w:tab w:val="left" w:pos="916"/>
+          <w:tab w:val="left" w:pos="1832"/>
+          <w:tab w:val="left" w:pos="2748"/>
+          <w:tab w:val="left" w:pos="3664"/>
+          <w:tab w:val="left" w:pos="4580"/>
+          <w:tab w:val="left" w:pos="5496"/>
+          <w:tab w:val="left" w:pos="6412"/>
+          <w:tab w:val="left" w:pos="7328"/>
+          <w:tab w:val="left" w:pos="8244"/>
+          <w:tab w:val="left" w:pos="9160"/>
+          <w:tab w:val="left" w:pos="10076"/>
+          <w:tab w:val="left" w:pos="10992"/>
+          <w:tab w:val="left" w:pos="11908"/>
+          <w:tab w:val="left" w:pos="12824"/>
+          <w:tab w:val="left" w:pos="13740"/>
+          <w:tab w:val="left" w:pos="14656"/>
+        </w:tabs>
+        <w:spacing w:after="0" w:line="240" w:lineRule="auto"/>
+        <w:rPr>
+          <w:rFonts w:ascii="Courier New" w:eastAsia="Times New Roman" w:hAnsi="Courier New" w:cs="Courier New"/>
+          <w:sz w:val="20"/>
+          <w:szCs w:val="20"/>
+        </w:rPr>
+      </w:pPr>
+      <w:r>
+        <w:rPr>
+          <w:rFonts w:ascii="Courier New" w:eastAsia="Times New Roman" w:hAnsi="Courier New" w:cs="Courier New"/>
+          <w:sz w:val="20"/>
+          <w:szCs w:val="20"/>
+        </w:rPr>
+        <w:t>npx expo install jest-expo jest @types/jest --dev -- --legacy-peer-deps</w:t>
+      </w:r>
+    </w:p>
+    <w:p>
+      <w:pPr>
+        <w:spacing w:before="100" w:beforeAutospacing="1" w:after="100" w:afterAutospacing="1" w:line="240" w:lineRule="auto"/>
+        <w:rPr>
+          <w:rFonts w:ascii="Times New Roman" w:eastAsia="Times New Roman" w:hAnsi="Times New Roman" w:cs="Times New Roman"/>
+          <w:sz w:val="24"/>
+          <w:szCs w:val="24"/>
+        </w:rPr>
+      </w:pPr>
+      <w:r>
+        <w:rPr>
+          <w:rFonts w:ascii="Times New Roman" w:eastAsia="Times New Roman" w:hAnsi="Times New Roman" w:cs="Times New Roman"/>
+          <w:sz w:val="24"/>
+          <w:szCs w:val="24"/>
+        </w:rPr>
+        <w:t xml:space="preserve">Nếu lệnh thứ hai vẫn báo </w:t>
+      </w:r>
+      <w:r>
+        <w:rPr>
+          <w:rFonts w:ascii="Courier New" w:eastAsia="Times New Roman" w:hAnsi="Courier New" w:cs="Courier New"/>
+          <w:sz w:val="20"/>
+          <w:szCs w:val="20"/>
+        </w:rPr>
+        <w:t>ERESOLVE</w:t>
+      </w:r>
+      <w:r>
+        <w:rPr>
+          <w:rFonts w:ascii="Times New Roman" w:eastAsia="Times New Roman" w:hAnsi="Times New Roman" w:cs="Times New Roman"/>
+          <w:sz w:val="24"/>
+          <w:szCs w:val="24"/>
+        </w:rPr>
+        <w:t>, đừng chạy thêm các lệnh cài đặt khác vội.</w:t>
+      </w:r>
+    </w:p>
+    <w:p>
+      <w:pPr>
+        <w:pStyle w:val="HTMLPreformatted"/>
+      </w:pPr>
+      <w:bookmarkStart w:id="0" w:name="_GoBack"/>
+      <w:bookmarkEnd w:id="0"/>
+      <w:r>
+        <w:rPr>
+          <w:rStyle w:val="s"/>
+        </w:rPr>
+        <w:t>npm</w:t>
+      </w:r>
+      <w:r>
+        <w:rPr>
+          <w:rStyle w:val="HTMLCode"/>
+        </w:rPr>
+        <w:t xml:space="preserve"> install </w:t>
+      </w:r>
+      <w:r>
+        <w:rPr>
+          <w:rStyle w:val="u"/>
+        </w:rPr>
+        <w:t>--save-dev</w:t>
+      </w:r>
+      <w:r>
+        <w:rPr>
+          <w:rStyle w:val="HTMLCode"/>
+        </w:rPr>
+        <w:t xml:space="preserve"> @react-native/jest-preset </w:t>
+      </w:r>
+      <w:r>
+        <w:rPr>
+          <w:rStyle w:val="u"/>
+        </w:rPr>
+        <w:t>--legacy-peer-deps</w:t>
+      </w:r>
+    </w:p>
+    <w:p>
+      <w:pPr>
+        <w:spacing w:before="100" w:beforeAutospacing="1" w:after="100" w:afterAutospacing="1" w:line="240" w:lineRule="auto"/>
+        <w:rPr>
+          <w:rFonts w:ascii="Times New Roman" w:eastAsia="Times New Roman" w:hAnsi="Times New Roman" w:cs="Times New Roman"/>
+          <w:sz w:val="24"/>
+          <w:szCs w:val="24"/>
+        </w:rPr>
+      </w:pPr>
+    </w:p>
+    <w:p>
+      <w:pPr>
+        <w:spacing w:before="100" w:beforeAutospacing="1" w:after="100" w:afterAutospacing="1" w:line="240" w:lineRule="auto"/>
+        <w:outlineLvl w:val="2"/>
+        <w:rPr>
+          <w:rFonts w:ascii="Times New Roman" w:eastAsia="Times New Roman" w:hAnsi="Times New Roman" w:cs="Times New Roman"/>
+          <w:b/>
+          <w:bCs/>
+          <w:sz w:val="27"/>
+          <w:szCs w:val="27"/>
+        </w:rPr>
+      </w:pPr>
+      <w:r>
+        <w:rPr>
+          <w:rFonts w:ascii="Times New Roman" w:eastAsia="Times New Roman" w:hAnsi="Times New Roman" w:cs="Times New Roman"/>
+          <w:b/>
+          <w:bCs/>
+          <w:sz w:val="27"/>
+          <w:szCs w:val="27"/>
+        </w:rPr>
+        <w:t>Bước 2: Chạy test</w:t>
+      </w:r>
+    </w:p>
+    <w:p>
+      <w:pPr>
+        <w:spacing w:before="100" w:beforeAutospacing="1" w:after="100" w:afterAutospacing="1" w:line="240" w:lineRule="auto"/>
+        <w:rPr>
+          <w:rFonts w:ascii="Times New Roman" w:eastAsia="Times New Roman" w:hAnsi="Times New Roman" w:cs="Times New Roman"/>
+          <w:sz w:val="24"/>
+          <w:szCs w:val="24"/>
+        </w:rPr>
+      </w:pPr>
+      <w:r>
+        <w:rPr>
+          <w:rFonts w:ascii="Times New Roman" w:eastAsia="Times New Roman" w:hAnsi="Times New Roman" w:cs="Times New Roman"/>
+          <w:sz w:val="24"/>
+          <w:szCs w:val="24"/>
+        </w:rPr>
+        <w:t>Khi cài đặt hoàn tất, chạy:</w:t>
+      </w:r>
+    </w:p>
+    <w:p>
+      <w:pPr>
+        <w:tabs>
+          <w:tab w:val="left" w:pos="916"/>
+          <w:tab w:val="left" w:pos="1832"/>
+          <w:tab w:val="left" w:pos="2748"/>
+          <w:tab w:val="left" w:pos="3664"/>
+          <w:tab w:val="left" w:pos="4580"/>
+          <w:tab w:val="left" w:pos="5496"/>
+          <w:tab w:val="left" w:pos="6412"/>
+          <w:tab w:val="left" w:pos="7328"/>
+          <w:tab w:val="left" w:pos="8244"/>
+          <w:tab w:val="left" w:pos="9160"/>
+          <w:tab w:val="left" w:pos="10076"/>
+          <w:tab w:val="left" w:pos="10992"/>
+          <w:tab w:val="left" w:pos="11908"/>
+          <w:tab w:val="left" w:pos="12824"/>
+          <w:tab w:val="left" w:pos="13740"/>
+          <w:tab w:val="left" w:pos="14656"/>
+        </w:tabs>
+        <w:spacing w:after="0" w:line="240" w:lineRule="auto"/>
+        <w:rPr>
+          <w:rFonts w:ascii="Courier New" w:eastAsia="Times New Roman" w:hAnsi="Courier New" w:cs="Courier New"/>
+          <w:sz w:val="20"/>
+          <w:szCs w:val="20"/>
+        </w:rPr>
+      </w:pPr>
+      <w:r>
+        <w:rPr>
+          <w:rFonts w:ascii="Courier New" w:eastAsia="Times New Roman" w:hAnsi="Courier New" w:cs="Courier New"/>
+          <w:sz w:val="20"/>
+          <w:szCs w:val="20"/>
+        </w:rPr>
+        <w:t>npm test</w:t>
+      </w:r>
+    </w:p>
+    <w:p>
+      <w:pPr>
+        <w:rPr>
+          <w:rFonts w:ascii="Consolas" w:hAnsi="Consolas"/>
+          <w:color w:val="F9FAFB"/>
+          <w:sz w:val="20"/>
+          <w:szCs w:val="20"/>
+          <w:shd w:val="clear" w:color="auto" w:fill="2C2C2E"/>
+        </w:rPr>
+      </w:pPr>
+    </w:p>
     <w:p>
       <w:pPr>
         <w:rPr>
@@ -206,27 +699,173 @@
       </w:pPr>
       <w:r>
         <w:rPr>
+          <w:rFonts w:ascii="Consolas" w:hAnsi="Consolas"/>
+          <w:color w:val="F9FAFB"/>
+          <w:sz w:val="20"/>
+          <w:szCs w:val="20"/>
+          <w:shd w:val="clear" w:color="auto" w:fill="2C2C2E"/>
+        </w:rPr>
+        <w:t>Shift + Alt + F</w:t>
+      </w:r>
+    </w:p>
+    <w:p>
+      <w:pPr>
+        <w:rPr>
           <w:lang w:val="vi-VN"/>
         </w:rPr>
-        <w:lastRenderedPageBreak/>
-        <w:t xml:space="preserve">Css kết hợp inline với styleSheet phải cho vô mảng </w:t>
-      </w:r>
-    </w:p>
-    <w:p>
-      <w:pPr>
+      </w:pPr>
+      <w:r>
         <w:rPr>
           <w:lang w:val="vi-VN"/>
         </w:rPr>
-      </w:pPr>
+        <w:t xml:space="preserve">CHI TIET VE: nav, flatlist, prop, type, filter, fetch, safe area </w:t>
+      </w:r>
       <w:r>
         <w:rPr>
           <w:lang w:val="vi-VN"/>
         </w:rPr>
+        <w:t>view,</w:t>
+      </w:r>
+      <w:r>
+        <w:rPr>
+          <w:lang w:val="vi-VN"/>
+        </w:rPr>
+        <w:t xml:space="preserve"> </w:t>
+      </w:r>
+      <w:r>
+        <w:rPr>
+          <w:rFonts w:ascii="Consolas" w:hAnsi="Consolas"/>
+          <w:color w:val="000000" w:themeColor="text1"/>
+          <w:sz w:val="26"/>
+          <w:szCs w:val="26"/>
+        </w:rPr>
+        <w:t>SafeAreaProvider</w:t>
+      </w:r>
+      <w:r>
+        <w:rPr>
+          <w:lang w:val="vi-VN"/>
+        </w:rPr>
+        <w:t>,</w:t>
+      </w:r>
+      <w:r>
+        <w:rPr>
+          <w:lang w:val="vi-VN"/>
+        </w:rPr>
+        <w:t xml:space="preserve"> </w:t>
+      </w:r>
+      <w:r>
+        <w:rPr>
+          <w:lang w:val="vi-VN"/>
+        </w:rPr>
+        <w:t xml:space="preserve">scroll </w:t>
+      </w:r>
+      <w:r>
+        <w:rPr>
+          <w:lang w:val="vi-VN"/>
+        </w:rPr>
+        <w:t>view, cac kieu khai bao react. Voi ?,...</w:t>
+      </w:r>
+    </w:p>
+    <w:p>
+      <w:pPr>
+        <w:rPr>
+          <w:lang w:val="vi-VN"/>
+        </w:rPr>
+      </w:pPr>
+      <w:r>
+        <w:rPr>
+          <w:lang w:val="vi-VN"/>
+        </w:rPr>
+        <w:t>TAI THU VIEN: safearea, nav</w:t>
+      </w:r>
+    </w:p>
+    <w:p>
+      <w:pPr>
+        <w:rPr>
+          <w:lang w:val="vi-VN"/>
+        </w:rPr>
+      </w:pPr>
+      <w:r>
+        <w:rPr>
+          <w:lang w:val="vi-VN"/>
+        </w:rPr>
+        <w:t>npm install @react-navigation/native @react-navigation/native-stack</w:t>
+      </w:r>
+    </w:p>
+    <w:p>
+      <w:pPr>
+        <w:rPr>
+          <w:lang w:val="vi-VN"/>
+        </w:rPr>
+      </w:pPr>
+      <w:r>
+        <w:rPr>
+          <w:lang w:val="vi-VN"/>
+        </w:rPr>
+        <w:t>npx expo install react-native-screens react-native-safe-area-context</w:t>
+      </w:r>
+    </w:p>
+    <w:p>
+      <w:pPr>
+        <w:rPr>
+          <w:lang w:val="vi-VN"/>
+        </w:rPr>
+      </w:pPr>
+    </w:p>
+    <w:p>
+      <w:r>
+        <w:t>- tao prj</w:t>
+      </w:r>
+    </w:p>
+    <w:p>
+      <w:r>
+        <w:t>npx create-expo-app MovieApp --template blank-typescript</w:t>
+      </w:r>
+    </w:p>
+    <w:p>
+      <w:r>
+        <w:t>cd MovieApp</w:t>
+      </w:r>
+    </w:p>
+    <w:p>
+      <w:r>
+        <w:t>npx expo install react-dom react-native-web</w:t>
+      </w:r>
+    </w:p>
+    <w:p>
+      <w:r>
+        <w:t xml:space="preserve">npm run web                                </w:t>
+      </w:r>
+    </w:p>
+    <w:p>
+      <w:pPr>
+        <w:rPr>
+          <w:b/>
+        </w:rPr>
+      </w:pPr>
+      <w:r>
+        <w:rPr>
+          <w:b/>
+        </w:rPr>
+        <w:t xml:space="preserve">Neu bao loi: </w:t>
+      </w:r>
+    </w:p>
+    <w:p>
+      <w:pPr>
+        <w:rPr>
+          <w:b/>
+        </w:rPr>
+      </w:pPr>
+      <w:r>
+        <w:rPr>
+          <w:b/>
+          <w:noProof/>
+        </w:rPr>
         <w:drawing>
-          <wp:inline distT="0" distB="0" distL="0" distR="0" wp14:anchorId="2843F9B1" wp14:editId="40CA6C1B">
-            <wp:extent cx="5943600" cy="170180"/>
-            <wp:effectExtent l="0" t="0" r="0" b="1270"/>
-            <wp:docPr id="4" name="Picture 4"/>
+          <wp:inline distT="0" distB="0" distL="0" distR="0" wp14:anchorId="5F962190" wp14:editId="4F7E1B26">
+            <wp:extent cx="3662886" cy="1976600"/>
+            <wp:effectExtent l="0" t="0" r="0" b="5080"/>
+            <wp:docPr id="6" name="Picture 6"/>
             <wp:cNvGraphicFramePr>
               <a:graphicFrameLocks xmlns:a="http://schemas.openxmlformats.org/drawingml/2006/main" noChangeAspect="1"/>
             </wp:cNvGraphicFramePr>
@@ -246,7 +885,7 @@
                   <pic:spPr>
                     <a:xfrm>
                       <a:off x="0" y="0"/>
-                      <a:ext cx="5943600" cy="170180"/>
+                      <a:ext cx="3722814" cy="2008939"/>
                     </a:xfrm>
                     <a:prstGeom prst="rect">
                       <a:avLst/>
@@ -262,26 +901,33 @@
     <w:p>
       <w:pPr>
         <w:rPr>
-          <w:lang w:val="vi-VN"/>
-        </w:rPr>
-      </w:pPr>
-      <w:r>
-        <w:rPr>
-          <w:lang w:val="vi-VN"/>
-        </w:rPr>
-        <w:t>* CÓ thể lọc trong mảng bằng filter, rồi cho dsXeHT vô trong data của FlatList</w:t>
-      </w:r>
-      <w:bookmarkStart w:id="0" w:name="_GoBack"/>
-      <w:bookmarkEnd w:id="0"/>
-      <w:r>
-        <w:rPr>
-          <w:lang w:val="vi-VN"/>
-        </w:rPr>
+          <w:b/>
+        </w:rPr>
+      </w:pPr>
+      <w:r>
+        <w:rPr>
+          <w:b/>
+        </w:rPr>
+        <w:t xml:space="preserve">B2: </w:t>
+      </w:r>
+    </w:p>
+    <w:p>
+      <w:pPr>
+        <w:rPr>
+          <w:b/>
+        </w:rPr>
+      </w:pPr>
+      <w:r>
+        <w:rPr>
+          <w:b/>
+          <w:noProof/>
+        </w:rPr>
+        <w:lastRenderedPageBreak/>
         <w:drawing>
-          <wp:inline distT="0" distB="0" distL="0" distR="0" wp14:anchorId="5701F5CD" wp14:editId="7FB28DD8">
-            <wp:extent cx="5819818" cy="762006"/>
+          <wp:inline distT="0" distB="0" distL="0" distR="0" wp14:anchorId="2175E3B4" wp14:editId="0A7BE856">
+            <wp:extent cx="2135362" cy="2371168"/>
             <wp:effectExtent l="0" t="0" r="0" b="0"/>
-            <wp:docPr id="5" name="Picture 5"/>
+            <wp:docPr id="8" name="Picture 8"/>
             <wp:cNvGraphicFramePr>
               <a:graphicFrameLocks xmlns:a="http://schemas.openxmlformats.org/drawingml/2006/main" noChangeAspect="1"/>
             </wp:cNvGraphicFramePr>
@@ -301,6 +947,1667 @@
                   <pic:spPr>
                     <a:xfrm>
                       <a:off x="0" y="0"/>
+                      <a:ext cx="2151547" cy="2389140"/>
+                    </a:xfrm>
+                    <a:prstGeom prst="rect">
+                      <a:avLst/>
+                    </a:prstGeom>
+                  </pic:spPr>
+                </pic:pic>
+              </a:graphicData>
+            </a:graphic>
+          </wp:inline>
+        </w:drawing>
+      </w:r>
+    </w:p>
+    <w:p>
+      <w:pPr>
+        <w:rPr>
+          <w:b/>
+          <w:lang w:val="vi-VN"/>
+        </w:rPr>
+      </w:pPr>
+      <w:r>
+        <w:rPr>
+          <w:b/>
+          <w:lang w:val="vi-VN"/>
+        </w:rPr>
+        <w:t>Alert</w:t>
+      </w:r>
+    </w:p>
+    <w:p>
+      <w:r>
+        <w:rPr>
+          <w:noProof/>
+        </w:rPr>
+        <w:drawing>
+          <wp:inline distT="0" distB="0" distL="0" distR="0" wp14:anchorId="62B345CD" wp14:editId="7EC2B9FC">
+            <wp:extent cx="5943600" cy="1153795"/>
+            <wp:effectExtent l="0" t="0" r="0" b="8255"/>
+            <wp:docPr id="7" name="Picture 7"/>
+            <wp:cNvGraphicFramePr>
+              <a:graphicFrameLocks xmlns:a="http://schemas.openxmlformats.org/drawingml/2006/main" noChangeAspect="1"/>
+            </wp:cNvGraphicFramePr>
+            <a:graphic xmlns:a="http://schemas.openxmlformats.org/drawingml/2006/main">
+              <a:graphicData uri="http://schemas.openxmlformats.org/drawingml/2006/picture">
+                <pic:pic xmlns:pic="http://schemas.openxmlformats.org/drawingml/2006/picture">
+                  <pic:nvPicPr>
+                    <pic:cNvPr id="1" name=""/>
+                    <pic:cNvPicPr/>
+                  </pic:nvPicPr>
+                  <pic:blipFill>
+                    <a:blip r:embed="rId9"/>
+                    <a:stretch>
+                      <a:fillRect/>
+                    </a:stretch>
+                  </pic:blipFill>
+                  <pic:spPr>
+                    <a:xfrm>
+                      <a:off x="0" y="0"/>
+                      <a:ext cx="5943600" cy="1153795"/>
+                    </a:xfrm>
+                    <a:prstGeom prst="rect">
+                      <a:avLst/>
+                    </a:prstGeom>
+                  </pic:spPr>
+                </pic:pic>
+              </a:graphicData>
+            </a:graphic>
+          </wp:inline>
+        </w:drawing>
+      </w:r>
+    </w:p>
+    <w:p>
+      <w:r>
+        <w:rPr>
+          <w:noProof/>
+        </w:rPr>
+        <w:drawing>
+          <wp:inline distT="0" distB="0" distL="0" distR="0" wp14:anchorId="4A21CE07" wp14:editId="65F915EB">
+            <wp:extent cx="5943600" cy="2532380"/>
+            <wp:effectExtent l="0" t="0" r="0" b="1270"/>
+            <wp:docPr id="1" name="Picture 1"/>
+            <wp:cNvGraphicFramePr>
+              <a:graphicFrameLocks xmlns:a="http://schemas.openxmlformats.org/drawingml/2006/main" noChangeAspect="1"/>
+            </wp:cNvGraphicFramePr>
+            <a:graphic xmlns:a="http://schemas.openxmlformats.org/drawingml/2006/main">
+              <a:graphicData uri="http://schemas.openxmlformats.org/drawingml/2006/picture">
+                <pic:pic xmlns:pic="http://schemas.openxmlformats.org/drawingml/2006/picture">
+                  <pic:nvPicPr>
+                    <pic:cNvPr id="1" name=""/>
+                    <pic:cNvPicPr/>
+                  </pic:nvPicPr>
+                  <pic:blipFill>
+                    <a:blip r:embed="rId10"/>
+                    <a:stretch>
+                      <a:fillRect/>
+                    </a:stretch>
+                  </pic:blipFill>
+                  <pic:spPr>
+                    <a:xfrm>
+                      <a:off x="0" y="0"/>
+                      <a:ext cx="5943600" cy="2532380"/>
+                    </a:xfrm>
+                    <a:prstGeom prst="rect">
+                      <a:avLst/>
+                    </a:prstGeom>
+                  </pic:spPr>
+                </pic:pic>
+              </a:graphicData>
+            </a:graphic>
+          </wp:inline>
+        </w:drawing>
+      </w:r>
+    </w:p>
+    <w:p>
+      <w:pPr>
+        <w:pStyle w:val="HTMLPreformatted"/>
+        <w:wordWrap w:val="0"/>
+        <w:spacing w:line="330" w:lineRule="atLeast"/>
+        <w:rPr>
+          <w:rFonts w:ascii="Consolas" w:hAnsi="Consolas"/>
+          <w:color w:val="F9FAFB"/>
+        </w:rPr>
+      </w:pPr>
+      <w:r>
+        <w:rPr>
+          <w:lang w:val="vi-VN"/>
+        </w:rPr>
+        <w:t xml:space="preserve">Css ảnh ko bị cắt : </w:t>
+      </w:r>
+      <w:r>
+        <w:rPr>
+          <w:rFonts w:ascii="Consolas" w:hAnsi="Consolas"/>
+          <w:color w:val="6CB8E6"/>
+        </w:rPr>
+        <w:t>resizeMode</w:t>
+      </w:r>
+      <w:r>
+        <w:rPr>
+          <w:rFonts w:ascii="Consolas" w:hAnsi="Consolas"/>
+          <w:color w:val="E9AE7E"/>
+        </w:rPr>
+        <w:t>:</w:t>
+      </w:r>
+      <w:r>
+        <w:rPr>
+          <w:rFonts w:ascii="Consolas" w:hAnsi="Consolas"/>
+          <w:color w:val="F9FAFB"/>
+        </w:rPr>
+        <w:t xml:space="preserve"> </w:t>
+      </w:r>
+      <w:r>
+        <w:rPr>
+          <w:rFonts w:ascii="Consolas" w:hAnsi="Consolas"/>
+          <w:color w:val="91D076"/>
+        </w:rPr>
+        <w:t>"contain"</w:t>
+      </w:r>
+      <w:r>
+        <w:rPr>
+          <w:rFonts w:ascii="Consolas" w:hAnsi="Consolas"/>
+          <w:color w:val="E3EAF2"/>
+        </w:rPr>
+        <w:t>,</w:t>
+      </w:r>
+    </w:p>
+    <w:p>
+      <w:pPr>
+        <w:rPr>
+          <w:lang w:val="vi-VN"/>
+        </w:rPr>
+      </w:pPr>
+    </w:p>
+    <w:p>
+      <w:pPr>
+        <w:pStyle w:val="Heading3"/>
+        <w:shd w:val="clear" w:color="auto" w:fill="151517"/>
+        <w:spacing w:before="480" w:beforeAutospacing="0" w:after="240" w:afterAutospacing="0" w:line="450" w:lineRule="atLeast"/>
+        <w:rPr>
+          <w:rFonts w:ascii="Segoe UI" w:hAnsi="Segoe UI" w:cs="Segoe UI"/>
+          <w:color w:val="F9FAFB"/>
+          <w:sz w:val="30"/>
+          <w:szCs w:val="30"/>
+        </w:rPr>
+      </w:pPr>
+      <w:r>
+        <w:rPr>
+          <w:rFonts w:ascii="Segoe UI" w:hAnsi="Segoe UI" w:cs="Segoe UI"/>
+          <w:color w:val="F9FAFB"/>
+          <w:sz w:val="30"/>
+          <w:szCs w:val="30"/>
+        </w:rPr>
+        <w:t xml:space="preserve">1️⃣ Item trong </w:t>
+      </w:r>
+      <w:r>
+        <w:rPr>
+          <w:rStyle w:val="HTMLCode"/>
+          <w:rFonts w:ascii="Consolas" w:hAnsi="Consolas"/>
+          <w:color w:val="F9FAFB"/>
+          <w:shd w:val="clear" w:color="auto" w:fill="2C2C2E"/>
+        </w:rPr>
+        <w:t>FlatList</w:t>
+      </w:r>
+      <w:r>
+        <w:rPr>
+          <w:rFonts w:ascii="Segoe UI" w:hAnsi="Segoe UI" w:cs="Segoe UI"/>
+          <w:color w:val="F9FAFB"/>
+          <w:sz w:val="30"/>
+          <w:szCs w:val="30"/>
+        </w:rPr>
+        <w:t xml:space="preserve"> chia nhiều cột</w:t>
+      </w:r>
+    </w:p>
+    <w:p>
+      <w:pPr>
+        <w:shd w:val="clear" w:color="auto" w:fill="151517"/>
+        <w:spacing w:line="300" w:lineRule="atLeast"/>
+        <w:rPr>
+          <w:rFonts w:ascii="Segoe UI" w:hAnsi="Segoe UI" w:cs="Segoe UI"/>
+          <w:color w:val="F9FAFB"/>
+          <w:sz w:val="20"/>
+          <w:szCs w:val="20"/>
+        </w:rPr>
+      </w:pPr>
+      <w:r>
+        <w:rPr>
+          <w:rStyle w:val="d813de27"/>
+          <w:rFonts w:ascii="Consolas" w:hAnsi="Consolas" w:cs="Segoe UI"/>
+          <w:color w:val="F9FAFB"/>
+          <w:sz w:val="18"/>
+          <w:szCs w:val="18"/>
+        </w:rPr>
+        <w:t>tsx</w:t>
+      </w:r>
+    </w:p>
+    <w:p>
+      <w:pPr>
+        <w:pStyle w:val="HTMLPreformatted"/>
+        <w:wordWrap w:val="0"/>
+        <w:spacing w:line="330" w:lineRule="atLeast"/>
+        <w:rPr>
+          <w:rFonts w:ascii="Consolas" w:hAnsi="Consolas"/>
+          <w:color w:val="F9FAFB"/>
+        </w:rPr>
+      </w:pPr>
+      <w:r>
+        <w:rPr>
+          <w:rStyle w:val="token"/>
+          <w:rFonts w:ascii="Consolas" w:hAnsi="Consolas"/>
+          <w:color w:val="8DA1B9"/>
+        </w:rPr>
+        <w:lastRenderedPageBreak/>
+        <w:t>// FlatList numColumns={2}</w:t>
+      </w:r>
+    </w:p>
+    <w:p>
+      <w:pPr>
+        <w:pStyle w:val="HTMLPreformatted"/>
+        <w:wordWrap w:val="0"/>
+        <w:spacing w:line="330" w:lineRule="atLeast"/>
+        <w:rPr>
+          <w:rFonts w:ascii="Consolas" w:hAnsi="Consolas"/>
+          <w:color w:val="F9FAFB"/>
+        </w:rPr>
+      </w:pPr>
+      <w:r>
+        <w:rPr>
+          <w:rStyle w:val="token"/>
+          <w:rFonts w:ascii="Consolas" w:hAnsi="Consolas"/>
+          <w:color w:val="66CCCC"/>
+        </w:rPr>
+        <w:t>&lt;</w:t>
+      </w:r>
+      <w:r>
+        <w:rPr>
+          <w:rStyle w:val="token"/>
+          <w:rFonts w:ascii="Consolas" w:hAnsi="Consolas"/>
+          <w:color w:val="6CB8E6"/>
+        </w:rPr>
+        <w:t>TouchableOpacity</w:t>
+      </w:r>
+      <w:r>
+        <w:rPr>
+          <w:rStyle w:val="token"/>
+          <w:rFonts w:ascii="Consolas" w:hAnsi="Consolas"/>
+          <w:color w:val="66CCCC"/>
+        </w:rPr>
+        <w:t xml:space="preserve"> </w:t>
+      </w:r>
+      <w:r>
+        <w:rPr>
+          <w:rStyle w:val="token"/>
+          <w:rFonts w:ascii="Consolas" w:hAnsi="Consolas"/>
+          <w:color w:val="E6D37A"/>
+        </w:rPr>
+        <w:t>style</w:t>
+      </w:r>
+      <w:r>
+        <w:rPr>
+          <w:rStyle w:val="token"/>
+          <w:rFonts w:ascii="Consolas" w:hAnsi="Consolas"/>
+          <w:color w:val="66CCCC"/>
+        </w:rPr>
+        <w:t>={{ flex</w:t>
+      </w:r>
+      <w:r>
+        <w:rPr>
+          <w:rStyle w:val="token"/>
+          <w:rFonts w:ascii="Consolas" w:hAnsi="Consolas"/>
+          <w:color w:val="E9AE7E"/>
+        </w:rPr>
+        <w:t>:</w:t>
+      </w:r>
+      <w:r>
+        <w:rPr>
+          <w:rStyle w:val="token"/>
+          <w:rFonts w:ascii="Consolas" w:hAnsi="Consolas"/>
+          <w:color w:val="66CCCC"/>
+        </w:rPr>
+        <w:t xml:space="preserve"> </w:t>
+      </w:r>
+      <w:r>
+        <w:rPr>
+          <w:rStyle w:val="token"/>
+          <w:rFonts w:ascii="Consolas" w:hAnsi="Consolas"/>
+          <w:color w:val="E6D37A"/>
+        </w:rPr>
+        <w:t>1</w:t>
+      </w:r>
+      <w:r>
+        <w:rPr>
+          <w:rStyle w:val="token"/>
+          <w:rFonts w:ascii="Consolas" w:hAnsi="Consolas"/>
+          <w:color w:val="66CCCC"/>
+        </w:rPr>
+        <w:t xml:space="preserve"> }}&gt;</w:t>
+      </w:r>
+      <w:r>
+        <w:rPr>
+          <w:rStyle w:val="token"/>
+          <w:rFonts w:ascii="Consolas" w:hAnsi="Consolas"/>
+          <w:color w:val="F9FAFB"/>
+        </w:rPr>
+        <w:t xml:space="preserve">   // ← BẮT BUỘC</w:t>
+      </w:r>
+    </w:p>
+    <w:p>
+      <w:pPr>
+        <w:pStyle w:val="ds-markdown-paragraph"/>
+        <w:shd w:val="clear" w:color="auto" w:fill="151517"/>
+        <w:spacing w:before="240" w:beforeAutospacing="0" w:after="240" w:afterAutospacing="0"/>
+        <w:rPr>
+          <w:rFonts w:ascii="Segoe UI" w:hAnsi="Segoe UI" w:cs="Segoe UI"/>
+          <w:color w:val="F9FAFB"/>
+        </w:rPr>
+      </w:pPr>
+      <w:r>
+        <w:rPr>
+          <w:rFonts w:ascii="Segoe UI" w:hAnsi="Segoe UI" w:cs="Segoe UI"/>
+          <w:color w:val="F9FAFB"/>
+        </w:rPr>
+        <w:t xml:space="preserve">→ Không có </w:t>
+      </w:r>
+      <w:r>
+        <w:rPr>
+          <w:rStyle w:val="HTMLCode"/>
+          <w:rFonts w:ascii="Consolas" w:hAnsi="Consolas"/>
+          <w:color w:val="F9FAFB"/>
+          <w:shd w:val="clear" w:color="auto" w:fill="2C2C2E"/>
+        </w:rPr>
+        <w:t>flex: 1</w:t>
+      </w:r>
+      <w:r>
+        <w:rPr>
+          <w:rFonts w:ascii="Segoe UI" w:hAnsi="Segoe UI" w:cs="Segoe UI"/>
+          <w:color w:val="F9FAFB"/>
+        </w:rPr>
+        <w:t xml:space="preserve"> → item không giãn đều 50% → cột không đều.</w:t>
+      </w:r>
+    </w:p>
+    <w:p>
+      <w:pPr>
+        <w:pStyle w:val="Heading3"/>
+        <w:shd w:val="clear" w:color="auto" w:fill="151517"/>
+        <w:spacing w:before="480" w:beforeAutospacing="0" w:after="240" w:afterAutospacing="0" w:line="450" w:lineRule="atLeast"/>
+        <w:rPr>
+          <w:rFonts w:ascii="Segoe UI" w:hAnsi="Segoe UI" w:cs="Segoe UI"/>
+          <w:color w:val="F9FAFB"/>
+          <w:sz w:val="30"/>
+          <w:szCs w:val="30"/>
+        </w:rPr>
+      </w:pPr>
+      <w:r>
+        <w:rPr>
+          <w:rFonts w:ascii="Segoe UI" w:hAnsi="Segoe UI" w:cs="Segoe UI"/>
+          <w:color w:val="F9FAFB"/>
+          <w:sz w:val="30"/>
+          <w:szCs w:val="30"/>
+        </w:rPr>
+        <w:t>2️⃣ Screen/Container chính</w:t>
+      </w:r>
+    </w:p>
+    <w:p>
+      <w:pPr>
+        <w:shd w:val="clear" w:color="auto" w:fill="151517"/>
+        <w:spacing w:line="300" w:lineRule="atLeast"/>
+        <w:rPr>
+          <w:rFonts w:ascii="Segoe UI" w:hAnsi="Segoe UI" w:cs="Segoe UI"/>
+          <w:color w:val="F9FAFB"/>
+          <w:sz w:val="20"/>
+          <w:szCs w:val="20"/>
+        </w:rPr>
+      </w:pPr>
+      <w:r>
+        <w:rPr>
+          <w:rStyle w:val="d813de27"/>
+          <w:rFonts w:ascii="Consolas" w:hAnsi="Consolas" w:cs="Segoe UI"/>
+          <w:color w:val="F9FAFB"/>
+          <w:sz w:val="18"/>
+          <w:szCs w:val="18"/>
+        </w:rPr>
+        <w:t>tsx</w:t>
+      </w:r>
+    </w:p>
+    <w:p>
+      <w:pPr>
+        <w:pStyle w:val="HTMLPreformatted"/>
+        <w:wordWrap w:val="0"/>
+        <w:spacing w:line="330" w:lineRule="atLeast"/>
+        <w:rPr>
+          <w:rFonts w:ascii="Consolas" w:hAnsi="Consolas"/>
+          <w:color w:val="F9FAFB"/>
+        </w:rPr>
+      </w:pPr>
+      <w:r>
+        <w:rPr>
+          <w:rStyle w:val="token"/>
+          <w:rFonts w:ascii="Consolas" w:hAnsi="Consolas"/>
+          <w:color w:val="66CCCC"/>
+        </w:rPr>
+        <w:t>&lt;</w:t>
+      </w:r>
+      <w:r>
+        <w:rPr>
+          <w:rStyle w:val="token"/>
+          <w:rFonts w:ascii="Consolas" w:hAnsi="Consolas"/>
+          <w:color w:val="6CB8E6"/>
+        </w:rPr>
+        <w:t>SafeAreaView</w:t>
+      </w:r>
+      <w:r>
+        <w:rPr>
+          <w:rStyle w:val="token"/>
+          <w:rFonts w:ascii="Consolas" w:hAnsi="Consolas"/>
+          <w:color w:val="66CCCC"/>
+        </w:rPr>
+        <w:t xml:space="preserve"> </w:t>
+      </w:r>
+      <w:r>
+        <w:rPr>
+          <w:rStyle w:val="token"/>
+          <w:rFonts w:ascii="Consolas" w:hAnsi="Consolas"/>
+          <w:color w:val="E6D37A"/>
+        </w:rPr>
+        <w:t>style</w:t>
+      </w:r>
+      <w:r>
+        <w:rPr>
+          <w:rStyle w:val="token"/>
+          <w:rFonts w:ascii="Consolas" w:hAnsi="Consolas"/>
+          <w:color w:val="66CCCC"/>
+        </w:rPr>
+        <w:t>={{ flex</w:t>
+      </w:r>
+      <w:r>
+        <w:rPr>
+          <w:rStyle w:val="token"/>
+          <w:rFonts w:ascii="Consolas" w:hAnsi="Consolas"/>
+          <w:color w:val="E9AE7E"/>
+        </w:rPr>
+        <w:t>:</w:t>
+      </w:r>
+      <w:r>
+        <w:rPr>
+          <w:rStyle w:val="token"/>
+          <w:rFonts w:ascii="Consolas" w:hAnsi="Consolas"/>
+          <w:color w:val="66CCCC"/>
+        </w:rPr>
+        <w:t xml:space="preserve"> </w:t>
+      </w:r>
+      <w:r>
+        <w:rPr>
+          <w:rStyle w:val="token"/>
+          <w:rFonts w:ascii="Consolas" w:hAnsi="Consolas"/>
+          <w:color w:val="E6D37A"/>
+        </w:rPr>
+        <w:t>1</w:t>
+      </w:r>
+      <w:r>
+        <w:rPr>
+          <w:rStyle w:val="token"/>
+          <w:rFonts w:ascii="Consolas" w:hAnsi="Consolas"/>
+          <w:color w:val="66CCCC"/>
+        </w:rPr>
+        <w:t xml:space="preserve"> }}&gt;</w:t>
+      </w:r>
+      <w:r>
+        <w:rPr>
+          <w:rStyle w:val="token"/>
+          <w:rFonts w:ascii="Consolas" w:hAnsi="Consolas"/>
+          <w:color w:val="F9FAFB"/>
+        </w:rPr>
+        <w:t xml:space="preserve">       // ← BẮT BUỘC</w:t>
+      </w:r>
+    </w:p>
+    <w:p>
+      <w:pPr>
+        <w:pStyle w:val="HTMLPreformatted"/>
+        <w:wordWrap w:val="0"/>
+        <w:spacing w:line="330" w:lineRule="atLeast"/>
+        <w:rPr>
+          <w:rFonts w:ascii="Consolas" w:hAnsi="Consolas"/>
+          <w:color w:val="F9FAFB"/>
+        </w:rPr>
+      </w:pPr>
+      <w:r>
+        <w:rPr>
+          <w:rFonts w:ascii="Consolas" w:hAnsi="Consolas"/>
+          <w:color w:val="F9FAFB"/>
+        </w:rPr>
+        <w:t xml:space="preserve">  </w:t>
+      </w:r>
+      <w:r>
+        <w:rPr>
+          <w:rStyle w:val="token"/>
+          <w:rFonts w:ascii="Consolas" w:hAnsi="Consolas"/>
+          <w:color w:val="66CCCC"/>
+        </w:rPr>
+        <w:t>&lt;</w:t>
+      </w:r>
+      <w:r>
+        <w:rPr>
+          <w:rStyle w:val="token"/>
+          <w:rFonts w:ascii="Consolas" w:hAnsi="Consolas"/>
+          <w:color w:val="6CB8E6"/>
+        </w:rPr>
+        <w:t>Text</w:t>
+      </w:r>
+      <w:r>
+        <w:rPr>
+          <w:rStyle w:val="token"/>
+          <w:rFonts w:ascii="Consolas" w:hAnsi="Consolas"/>
+          <w:color w:val="66CCCC"/>
+        </w:rPr>
+        <w:t>&gt;</w:t>
+      </w:r>
+      <w:r>
+        <w:rPr>
+          <w:rStyle w:val="token"/>
+          <w:rFonts w:ascii="Consolas" w:hAnsi="Consolas"/>
+          <w:color w:val="F9FAFB"/>
+        </w:rPr>
+        <w:t>Header</w:t>
+      </w:r>
+      <w:r>
+        <w:rPr>
+          <w:rStyle w:val="token"/>
+          <w:rFonts w:ascii="Consolas" w:hAnsi="Consolas"/>
+          <w:color w:val="66CCCC"/>
+        </w:rPr>
+        <w:t>&lt;/</w:t>
+      </w:r>
+      <w:r>
+        <w:rPr>
+          <w:rStyle w:val="token"/>
+          <w:rFonts w:ascii="Consolas" w:hAnsi="Consolas"/>
+          <w:color w:val="6CB8E6"/>
+        </w:rPr>
+        <w:t>Text</w:t>
+      </w:r>
+      <w:r>
+        <w:rPr>
+          <w:rStyle w:val="token"/>
+          <w:rFonts w:ascii="Consolas" w:hAnsi="Consolas"/>
+          <w:color w:val="66CCCC"/>
+        </w:rPr>
+        <w:t>&gt;</w:t>
+      </w:r>
+    </w:p>
+    <w:p>
+      <w:pPr>
+        <w:pStyle w:val="HTMLPreformatted"/>
+        <w:wordWrap w:val="0"/>
+        <w:spacing w:line="330" w:lineRule="atLeast"/>
+        <w:rPr>
+          <w:rFonts w:ascii="Consolas" w:hAnsi="Consolas"/>
+          <w:color w:val="F9FAFB"/>
+        </w:rPr>
+      </w:pPr>
+      <w:r>
+        <w:rPr>
+          <w:rFonts w:ascii="Consolas" w:hAnsi="Consolas"/>
+          <w:color w:val="F9FAFB"/>
+        </w:rPr>
+        <w:t xml:space="preserve">  </w:t>
+      </w:r>
+      <w:r>
+        <w:rPr>
+          <w:rStyle w:val="token"/>
+          <w:rFonts w:ascii="Consolas" w:hAnsi="Consolas"/>
+          <w:color w:val="66CCCC"/>
+        </w:rPr>
+        <w:t>&lt;</w:t>
+      </w:r>
+      <w:r>
+        <w:rPr>
+          <w:rStyle w:val="token"/>
+          <w:rFonts w:ascii="Consolas" w:hAnsi="Consolas"/>
+          <w:color w:val="6CB8E6"/>
+        </w:rPr>
+        <w:t>FlatList</w:t>
+      </w:r>
+      <w:r>
+        <w:rPr>
+          <w:rStyle w:val="token"/>
+          <w:rFonts w:ascii="Consolas" w:hAnsi="Consolas"/>
+          <w:color w:val="66CCCC"/>
+        </w:rPr>
+        <w:t xml:space="preserve"> /&gt;</w:t>
+      </w:r>
+      <w:r>
+        <w:rPr>
+          <w:rStyle w:val="token"/>
+          <w:rFonts w:ascii="Consolas" w:hAnsi="Consolas"/>
+          <w:color w:val="F9FAFB"/>
+        </w:rPr>
+        <w:t xml:space="preserve">     // ← cần parent có flex: 1 để cuộn đúng</w:t>
+      </w:r>
+    </w:p>
+    <w:p>
+      <w:pPr>
+        <w:pStyle w:val="HTMLPreformatted"/>
+        <w:wordWrap w:val="0"/>
+        <w:spacing w:line="330" w:lineRule="atLeast"/>
+        <w:rPr>
+          <w:rFonts w:ascii="Consolas" w:hAnsi="Consolas"/>
+          <w:color w:val="F9FAFB"/>
+        </w:rPr>
+      </w:pPr>
+      <w:r>
+        <w:rPr>
+          <w:rStyle w:val="token"/>
+          <w:rFonts w:ascii="Consolas" w:hAnsi="Consolas"/>
+          <w:color w:val="66CCCC"/>
+        </w:rPr>
+        <w:t>&lt;/</w:t>
+      </w:r>
+      <w:r>
+        <w:rPr>
+          <w:rStyle w:val="token"/>
+          <w:rFonts w:ascii="Consolas" w:hAnsi="Consolas"/>
+          <w:color w:val="6CB8E6"/>
+        </w:rPr>
+        <w:t>SafeAreaView</w:t>
+      </w:r>
+      <w:r>
+        <w:rPr>
+          <w:rStyle w:val="token"/>
+          <w:rFonts w:ascii="Consolas" w:hAnsi="Consolas"/>
+          <w:color w:val="66CCCC"/>
+        </w:rPr>
+        <w:t>&gt;</w:t>
+      </w:r>
+    </w:p>
+    <w:p>
+      <w:pPr>
+        <w:pStyle w:val="ds-markdown-paragraph"/>
+        <w:shd w:val="clear" w:color="auto" w:fill="151517"/>
+        <w:spacing w:before="240" w:beforeAutospacing="0" w:after="240" w:afterAutospacing="0"/>
+        <w:rPr>
+          <w:rFonts w:ascii="Segoe UI" w:hAnsi="Segoe UI" w:cs="Segoe UI"/>
+          <w:color w:val="F9FAFB"/>
+        </w:rPr>
+      </w:pPr>
+      <w:r>
+        <w:rPr>
+          <w:rFonts w:ascii="Segoe UI" w:hAnsi="Segoe UI" w:cs="Segoe UI"/>
+          <w:color w:val="F9FAFB"/>
+        </w:rPr>
+        <w:t xml:space="preserve">→ Không có </w:t>
+      </w:r>
+      <w:r>
+        <w:rPr>
+          <w:rStyle w:val="HTMLCode"/>
+          <w:rFonts w:ascii="Consolas" w:hAnsi="Consolas"/>
+          <w:color w:val="F9FAFB"/>
+          <w:shd w:val="clear" w:color="auto" w:fill="2C2C2E"/>
+        </w:rPr>
+        <w:t>flex: 1</w:t>
+      </w:r>
+      <w:r>
+        <w:rPr>
+          <w:rFonts w:ascii="Segoe UI" w:hAnsi="Segoe UI" w:cs="Segoe UI"/>
+          <w:color w:val="F9FAFB"/>
+        </w:rPr>
+        <w:t xml:space="preserve"> → FlatList không có chiều cao → </w:t>
+      </w:r>
+      <w:r>
+        <w:rPr>
+          <w:rStyle w:val="Strong"/>
+          <w:rFonts w:ascii="Segoe UI" w:hAnsi="Segoe UI" w:cs="Segoe UI"/>
+          <w:color w:val="F9FAFB"/>
+        </w:rPr>
+        <w:t>không cuộn được</w:t>
+      </w:r>
+      <w:r>
+        <w:rPr>
+          <w:rFonts w:ascii="Segoe UI" w:hAnsi="Segoe UI" w:cs="Segoe UI"/>
+          <w:color w:val="F9FAFB"/>
+        </w:rPr>
+        <w:t>.</w:t>
+      </w:r>
+    </w:p>
+    <w:p>
+      <w:pPr>
+        <w:pStyle w:val="Heading3"/>
+        <w:shd w:val="clear" w:color="auto" w:fill="151517"/>
+        <w:spacing w:before="480" w:beforeAutospacing="0" w:after="240" w:afterAutospacing="0" w:line="450" w:lineRule="atLeast"/>
+        <w:rPr>
+          <w:rFonts w:ascii="Segoe UI" w:hAnsi="Segoe UI" w:cs="Segoe UI"/>
+          <w:color w:val="F9FAFB"/>
+          <w:sz w:val="30"/>
+          <w:szCs w:val="30"/>
+        </w:rPr>
+      </w:pPr>
+      <w:r>
+        <w:rPr>
+          <w:rFonts w:ascii="Segoe UI" w:hAnsi="Segoe UI" w:cs="Segoe UI"/>
+          <w:color w:val="F9FAFB"/>
+          <w:sz w:val="30"/>
+          <w:szCs w:val="30"/>
+        </w:rPr>
+        <w:t>3️⃣ View bọc list cần cuộn</w:t>
+      </w:r>
+    </w:p>
+    <w:p>
+      <w:pPr>
+        <w:shd w:val="clear" w:color="auto" w:fill="151517"/>
+        <w:spacing w:line="300" w:lineRule="atLeast"/>
+        <w:rPr>
+          <w:rFonts w:ascii="Segoe UI" w:hAnsi="Segoe UI" w:cs="Segoe UI"/>
+          <w:color w:val="F9FAFB"/>
+          <w:sz w:val="20"/>
+          <w:szCs w:val="20"/>
+        </w:rPr>
+      </w:pPr>
+      <w:r>
+        <w:rPr>
+          <w:rStyle w:val="d813de27"/>
+          <w:rFonts w:ascii="Consolas" w:hAnsi="Consolas" w:cs="Segoe UI"/>
+          <w:color w:val="F9FAFB"/>
+          <w:sz w:val="18"/>
+          <w:szCs w:val="18"/>
+        </w:rPr>
+        <w:t>tsx</w:t>
+      </w:r>
+    </w:p>
+    <w:p>
+      <w:pPr>
+        <w:pStyle w:val="HTMLPreformatted"/>
+        <w:wordWrap w:val="0"/>
+        <w:spacing w:line="330" w:lineRule="atLeast"/>
+        <w:rPr>
+          <w:rFonts w:ascii="Consolas" w:hAnsi="Consolas"/>
+          <w:color w:val="F9FAFB"/>
+        </w:rPr>
+      </w:pPr>
+      <w:r>
+        <w:rPr>
+          <w:rStyle w:val="token"/>
+          <w:rFonts w:ascii="Consolas" w:hAnsi="Consolas"/>
+          <w:color w:val="66CCCC"/>
+        </w:rPr>
+        <w:t>&lt;</w:t>
+      </w:r>
+      <w:r>
+        <w:rPr>
+          <w:rStyle w:val="token"/>
+          <w:rFonts w:ascii="Consolas" w:hAnsi="Consolas"/>
+          <w:color w:val="6CB8E6"/>
+        </w:rPr>
+        <w:t>View</w:t>
+      </w:r>
+      <w:r>
+        <w:rPr>
+          <w:rStyle w:val="token"/>
+          <w:rFonts w:ascii="Consolas" w:hAnsi="Consolas"/>
+          <w:color w:val="66CCCC"/>
+        </w:rPr>
+        <w:t xml:space="preserve"> </w:t>
+      </w:r>
+      <w:r>
+        <w:rPr>
+          <w:rStyle w:val="token"/>
+          <w:rFonts w:ascii="Consolas" w:hAnsi="Consolas"/>
+          <w:color w:val="E6D37A"/>
+        </w:rPr>
+        <w:t>style</w:t>
+      </w:r>
+      <w:r>
+        <w:rPr>
+          <w:rStyle w:val="token"/>
+          <w:rFonts w:ascii="Consolas" w:hAnsi="Consolas"/>
+          <w:color w:val="66CCCC"/>
+        </w:rPr>
+        <w:t>={{ flex</w:t>
+      </w:r>
+      <w:r>
+        <w:rPr>
+          <w:rStyle w:val="token"/>
+          <w:rFonts w:ascii="Consolas" w:hAnsi="Consolas"/>
+          <w:color w:val="E9AE7E"/>
+        </w:rPr>
+        <w:t>:</w:t>
+      </w:r>
+      <w:r>
+        <w:rPr>
+          <w:rStyle w:val="token"/>
+          <w:rFonts w:ascii="Consolas" w:hAnsi="Consolas"/>
+          <w:color w:val="66CCCC"/>
+        </w:rPr>
+        <w:t xml:space="preserve"> </w:t>
+      </w:r>
+      <w:r>
+        <w:rPr>
+          <w:rStyle w:val="token"/>
+          <w:rFonts w:ascii="Consolas" w:hAnsi="Consolas"/>
+          <w:color w:val="E6D37A"/>
+        </w:rPr>
+        <w:t>1</w:t>
+      </w:r>
+      <w:r>
+        <w:rPr>
+          <w:rStyle w:val="token"/>
+          <w:rFonts w:ascii="Consolas" w:hAnsi="Consolas"/>
+          <w:color w:val="66CCCC"/>
+        </w:rPr>
+        <w:t xml:space="preserve"> }}&gt;</w:t>
+      </w:r>
+      <w:r>
+        <w:rPr>
+          <w:rStyle w:val="token"/>
+          <w:rFonts w:ascii="Consolas" w:hAnsi="Consolas"/>
+          <w:color w:val="F9FAFB"/>
+        </w:rPr>
+        <w:t xml:space="preserve">              // ← BẮT BUỘC</w:t>
+      </w:r>
+    </w:p>
+    <w:p>
+      <w:pPr>
+        <w:pStyle w:val="HTMLPreformatted"/>
+        <w:wordWrap w:val="0"/>
+        <w:spacing w:line="330" w:lineRule="atLeast"/>
+        <w:rPr>
+          <w:rFonts w:ascii="Consolas" w:hAnsi="Consolas"/>
+          <w:color w:val="F9FAFB"/>
+        </w:rPr>
+      </w:pPr>
+      <w:r>
+        <w:rPr>
+          <w:rFonts w:ascii="Consolas" w:hAnsi="Consolas"/>
+          <w:color w:val="F9FAFB"/>
+        </w:rPr>
+        <w:t xml:space="preserve">  </w:t>
+      </w:r>
+      <w:r>
+        <w:rPr>
+          <w:rStyle w:val="token"/>
+          <w:rFonts w:ascii="Consolas" w:hAnsi="Consolas"/>
+          <w:color w:val="66CCCC"/>
+        </w:rPr>
+        <w:t>&lt;</w:t>
+      </w:r>
+      <w:r>
+        <w:rPr>
+          <w:rStyle w:val="token"/>
+          <w:rFonts w:ascii="Consolas" w:hAnsi="Consolas"/>
+          <w:color w:val="6CB8E6"/>
+        </w:rPr>
+        <w:t>FlatList</w:t>
+      </w:r>
+      <w:r>
+        <w:rPr>
+          <w:rStyle w:val="token"/>
+          <w:rFonts w:ascii="Consolas" w:hAnsi="Consolas"/>
+          <w:color w:val="66CCCC"/>
+        </w:rPr>
+        <w:t xml:space="preserve"> </w:t>
+      </w:r>
+      <w:r>
+        <w:rPr>
+          <w:rStyle w:val="token"/>
+          <w:rFonts w:ascii="Consolas" w:hAnsi="Consolas"/>
+          <w:color w:val="E6D37A"/>
+        </w:rPr>
+        <w:t>data</w:t>
+      </w:r>
+      <w:r>
+        <w:rPr>
+          <w:rStyle w:val="token"/>
+          <w:rFonts w:ascii="Consolas" w:hAnsi="Consolas"/>
+          <w:color w:val="66CCCC"/>
+        </w:rPr>
+        <w:t>={</w:t>
+      </w:r>
+      <w:r>
+        <w:rPr>
+          <w:rStyle w:val="token"/>
+          <w:rFonts w:ascii="Consolas" w:hAnsi="Consolas"/>
+          <w:color w:val="E9AE7E"/>
+        </w:rPr>
+        <w:t>...</w:t>
+      </w:r>
+      <w:r>
+        <w:rPr>
+          <w:rStyle w:val="token"/>
+          <w:rFonts w:ascii="Consolas" w:hAnsi="Consolas"/>
+          <w:color w:val="66CCCC"/>
+        </w:rPr>
+        <w:t>} /&gt;</w:t>
+      </w:r>
+    </w:p>
+    <w:p>
+      <w:pPr>
+        <w:pStyle w:val="HTMLPreformatted"/>
+        <w:wordWrap w:val="0"/>
+        <w:spacing w:line="330" w:lineRule="atLeast"/>
+        <w:rPr>
+          <w:rFonts w:ascii="Consolas" w:hAnsi="Consolas"/>
+          <w:color w:val="F9FAFB"/>
+        </w:rPr>
+      </w:pPr>
+      <w:r>
+        <w:rPr>
+          <w:rStyle w:val="token"/>
+          <w:rFonts w:ascii="Consolas" w:hAnsi="Consolas"/>
+          <w:color w:val="66CCCC"/>
+        </w:rPr>
+        <w:t>&lt;/</w:t>
+      </w:r>
+      <w:r>
+        <w:rPr>
+          <w:rStyle w:val="token"/>
+          <w:rFonts w:ascii="Consolas" w:hAnsi="Consolas"/>
+          <w:color w:val="6CB8E6"/>
+        </w:rPr>
+        <w:t>View</w:t>
+      </w:r>
+      <w:r>
+        <w:rPr>
+          <w:rStyle w:val="token"/>
+          <w:rFonts w:ascii="Consolas" w:hAnsi="Consolas"/>
+          <w:color w:val="66CCCC"/>
+        </w:rPr>
+        <w:t>&gt;</w:t>
+      </w:r>
+    </w:p>
+    <w:p>
+      <w:pPr>
+        <w:pStyle w:val="ds-markdown-paragraph"/>
+        <w:shd w:val="clear" w:color="auto" w:fill="151517"/>
+        <w:spacing w:before="240" w:beforeAutospacing="0" w:after="240" w:afterAutospacing="0"/>
+        <w:rPr>
+          <w:rFonts w:ascii="Segoe UI" w:hAnsi="Segoe UI" w:cs="Segoe UI"/>
+          <w:color w:val="F9FAFB"/>
+        </w:rPr>
+      </w:pPr>
+      <w:r>
+        <w:rPr>
+          <w:rFonts w:ascii="Segoe UI" w:hAnsi="Segoe UI" w:cs="Segoe UI"/>
+          <w:color w:val="F9FAFB"/>
+        </w:rPr>
+        <w:t>→ Không có → FlatList cao bằng nội dung → không cuộn.</w:t>
+      </w:r>
+    </w:p>
+    <w:p>
+      <w:pPr>
+        <w:pStyle w:val="Heading3"/>
+        <w:shd w:val="clear" w:color="auto" w:fill="151517"/>
+        <w:spacing w:before="480" w:beforeAutospacing="0" w:after="240" w:afterAutospacing="0" w:line="450" w:lineRule="atLeast"/>
+        <w:rPr>
+          <w:rFonts w:ascii="Segoe UI" w:hAnsi="Segoe UI" w:cs="Segoe UI"/>
+          <w:color w:val="F9FAFB"/>
+          <w:sz w:val="30"/>
+          <w:szCs w:val="30"/>
+        </w:rPr>
+      </w:pPr>
+      <w:r>
+        <w:rPr>
+          <w:rFonts w:ascii="Segoe UI" w:hAnsi="Segoe UI" w:cs="Segoe UI"/>
+          <w:color w:val="F9FAFB"/>
+          <w:sz w:val="30"/>
+          <w:szCs w:val="30"/>
+        </w:rPr>
+        <w:t>4️⃣ Chia layout ngang — nhiều phần theo tỉ lệ</w:t>
+      </w:r>
+    </w:p>
+    <w:p>
+      <w:pPr>
+        <w:shd w:val="clear" w:color="auto" w:fill="151517"/>
+        <w:spacing w:line="300" w:lineRule="atLeast"/>
+        <w:rPr>
+          <w:rFonts w:ascii="Segoe UI" w:hAnsi="Segoe UI" w:cs="Segoe UI"/>
+          <w:color w:val="F9FAFB"/>
+          <w:sz w:val="20"/>
+          <w:szCs w:val="20"/>
+        </w:rPr>
+      </w:pPr>
+      <w:r>
+        <w:rPr>
+          <w:rStyle w:val="d813de27"/>
+          <w:rFonts w:ascii="Consolas" w:hAnsi="Consolas" w:cs="Segoe UI"/>
+          <w:color w:val="F9FAFB"/>
+          <w:sz w:val="18"/>
+          <w:szCs w:val="18"/>
+        </w:rPr>
+        <w:t>tsx</w:t>
+      </w:r>
+    </w:p>
+    <w:p>
+      <w:pPr>
+        <w:pStyle w:val="HTMLPreformatted"/>
+        <w:wordWrap w:val="0"/>
+        <w:spacing w:line="330" w:lineRule="atLeast"/>
+        <w:rPr>
+          <w:rFonts w:ascii="Consolas" w:hAnsi="Consolas"/>
+          <w:color w:val="F9FAFB"/>
+        </w:rPr>
+      </w:pPr>
+      <w:r>
+        <w:rPr>
+          <w:rStyle w:val="token"/>
+          <w:rFonts w:ascii="Consolas" w:hAnsi="Consolas"/>
+          <w:color w:val="66CCCC"/>
+        </w:rPr>
+        <w:t>&lt;</w:t>
+      </w:r>
+      <w:r>
+        <w:rPr>
+          <w:rStyle w:val="token"/>
+          <w:rFonts w:ascii="Consolas" w:hAnsi="Consolas"/>
+          <w:color w:val="6CB8E6"/>
+        </w:rPr>
+        <w:t>View</w:t>
+      </w:r>
+      <w:r>
+        <w:rPr>
+          <w:rStyle w:val="token"/>
+          <w:rFonts w:ascii="Consolas" w:hAnsi="Consolas"/>
+          <w:color w:val="66CCCC"/>
+        </w:rPr>
+        <w:t xml:space="preserve"> </w:t>
+      </w:r>
+      <w:r>
+        <w:rPr>
+          <w:rStyle w:val="token"/>
+          <w:rFonts w:ascii="Consolas" w:hAnsi="Consolas"/>
+          <w:color w:val="E6D37A"/>
+        </w:rPr>
+        <w:t>style</w:t>
+      </w:r>
+      <w:r>
+        <w:rPr>
+          <w:rStyle w:val="token"/>
+          <w:rFonts w:ascii="Consolas" w:hAnsi="Consolas"/>
+          <w:color w:val="66CCCC"/>
+        </w:rPr>
+        <w:t>={{ flexDirection</w:t>
+      </w:r>
+      <w:r>
+        <w:rPr>
+          <w:rStyle w:val="token"/>
+          <w:rFonts w:ascii="Consolas" w:hAnsi="Consolas"/>
+          <w:color w:val="E9AE7E"/>
+        </w:rPr>
+        <w:t>:</w:t>
+      </w:r>
+      <w:r>
+        <w:rPr>
+          <w:rStyle w:val="token"/>
+          <w:rFonts w:ascii="Consolas" w:hAnsi="Consolas"/>
+          <w:color w:val="66CCCC"/>
+        </w:rPr>
+        <w:t xml:space="preserve"> </w:t>
+      </w:r>
+      <w:r>
+        <w:rPr>
+          <w:rStyle w:val="token"/>
+          <w:rFonts w:ascii="Consolas" w:hAnsi="Consolas"/>
+          <w:color w:val="91D076"/>
+        </w:rPr>
+        <w:t>'row'</w:t>
+      </w:r>
+      <w:r>
+        <w:rPr>
+          <w:rStyle w:val="token"/>
+          <w:rFonts w:ascii="Consolas" w:hAnsi="Consolas"/>
+          <w:color w:val="66CCCC"/>
+        </w:rPr>
+        <w:t xml:space="preserve"> }}&gt;</w:t>
+      </w:r>
+    </w:p>
+    <w:p>
+      <w:pPr>
+        <w:pStyle w:val="HTMLPreformatted"/>
+        <w:wordWrap w:val="0"/>
+        <w:spacing w:line="330" w:lineRule="atLeast"/>
+        <w:rPr>
+          <w:rFonts w:ascii="Consolas" w:hAnsi="Consolas"/>
+          <w:color w:val="F9FAFB"/>
+        </w:rPr>
+      </w:pPr>
+      <w:r>
+        <w:rPr>
+          <w:rFonts w:ascii="Consolas" w:hAnsi="Consolas"/>
+          <w:color w:val="F9FAFB"/>
+        </w:rPr>
+        <w:t xml:space="preserve">  </w:t>
+      </w:r>
+      <w:r>
+        <w:rPr>
+          <w:rStyle w:val="token"/>
+          <w:rFonts w:ascii="Consolas" w:hAnsi="Consolas"/>
+          <w:color w:val="66CCCC"/>
+        </w:rPr>
+        <w:t>&lt;</w:t>
+      </w:r>
+      <w:r>
+        <w:rPr>
+          <w:rStyle w:val="token"/>
+          <w:rFonts w:ascii="Consolas" w:hAnsi="Consolas"/>
+          <w:color w:val="6CB8E6"/>
+        </w:rPr>
+        <w:t>View</w:t>
+      </w:r>
+      <w:r>
+        <w:rPr>
+          <w:rStyle w:val="token"/>
+          <w:rFonts w:ascii="Consolas" w:hAnsi="Consolas"/>
+          <w:color w:val="66CCCC"/>
+        </w:rPr>
+        <w:t xml:space="preserve"> </w:t>
+      </w:r>
+      <w:r>
+        <w:rPr>
+          <w:rStyle w:val="token"/>
+          <w:rFonts w:ascii="Consolas" w:hAnsi="Consolas"/>
+          <w:color w:val="E6D37A"/>
+        </w:rPr>
+        <w:t>style</w:t>
+      </w:r>
+      <w:r>
+        <w:rPr>
+          <w:rStyle w:val="token"/>
+          <w:rFonts w:ascii="Consolas" w:hAnsi="Consolas"/>
+          <w:color w:val="66CCCC"/>
+        </w:rPr>
+        <w:t>={{ flex</w:t>
+      </w:r>
+      <w:r>
+        <w:rPr>
+          <w:rStyle w:val="token"/>
+          <w:rFonts w:ascii="Consolas" w:hAnsi="Consolas"/>
+          <w:color w:val="E9AE7E"/>
+        </w:rPr>
+        <w:t>:</w:t>
+      </w:r>
+      <w:r>
+        <w:rPr>
+          <w:rStyle w:val="token"/>
+          <w:rFonts w:ascii="Consolas" w:hAnsi="Consolas"/>
+          <w:color w:val="66CCCC"/>
+        </w:rPr>
+        <w:t xml:space="preserve"> </w:t>
+      </w:r>
+      <w:r>
+        <w:rPr>
+          <w:rStyle w:val="token"/>
+          <w:rFonts w:ascii="Consolas" w:hAnsi="Consolas"/>
+          <w:color w:val="E6D37A"/>
+        </w:rPr>
+        <w:t>1</w:t>
+      </w:r>
+      <w:r>
+        <w:rPr>
+          <w:rStyle w:val="token"/>
+          <w:rFonts w:ascii="Consolas" w:hAnsi="Consolas"/>
+          <w:color w:val="66CCCC"/>
+        </w:rPr>
+        <w:t xml:space="preserve"> }}&gt;</w:t>
+      </w:r>
+      <w:r>
+        <w:rPr>
+          <w:rStyle w:val="token"/>
+          <w:rFonts w:ascii="Consolas" w:hAnsi="Consolas"/>
+          <w:color w:val="F9FAFB"/>
+        </w:rPr>
+        <w:t>Cột trái</w:t>
+      </w:r>
+      <w:r>
+        <w:rPr>
+          <w:rStyle w:val="token"/>
+          <w:rFonts w:ascii="Consolas" w:hAnsi="Consolas"/>
+          <w:color w:val="66CCCC"/>
+        </w:rPr>
+        <w:t>&lt;/</w:t>
+      </w:r>
+      <w:r>
+        <w:rPr>
+          <w:rStyle w:val="token"/>
+          <w:rFonts w:ascii="Consolas" w:hAnsi="Consolas"/>
+          <w:color w:val="6CB8E6"/>
+        </w:rPr>
+        <w:t>View</w:t>
+      </w:r>
+      <w:r>
+        <w:rPr>
+          <w:rStyle w:val="token"/>
+          <w:rFonts w:ascii="Consolas" w:hAnsi="Consolas"/>
+          <w:color w:val="66CCCC"/>
+        </w:rPr>
+        <w:t>&gt;</w:t>
+      </w:r>
+      <w:r>
+        <w:rPr>
+          <w:rStyle w:val="token"/>
+          <w:rFonts w:ascii="Consolas" w:hAnsi="Consolas"/>
+          <w:color w:val="F9FAFB"/>
+        </w:rPr>
+        <w:t xml:space="preserve">   // ← 50%</w:t>
+      </w:r>
+    </w:p>
+    <w:p>
+      <w:pPr>
+        <w:pStyle w:val="HTMLPreformatted"/>
+        <w:wordWrap w:val="0"/>
+        <w:spacing w:line="330" w:lineRule="atLeast"/>
+        <w:rPr>
+          <w:rFonts w:ascii="Consolas" w:hAnsi="Consolas"/>
+          <w:color w:val="F9FAFB"/>
+        </w:rPr>
+      </w:pPr>
+      <w:r>
+        <w:rPr>
+          <w:rFonts w:ascii="Consolas" w:hAnsi="Consolas"/>
+          <w:color w:val="F9FAFB"/>
+        </w:rPr>
+        <w:t xml:space="preserve">  </w:t>
+      </w:r>
+      <w:r>
+        <w:rPr>
+          <w:rStyle w:val="token"/>
+          <w:rFonts w:ascii="Consolas" w:hAnsi="Consolas"/>
+          <w:color w:val="66CCCC"/>
+        </w:rPr>
+        <w:t>&lt;</w:t>
+      </w:r>
+      <w:r>
+        <w:rPr>
+          <w:rStyle w:val="token"/>
+          <w:rFonts w:ascii="Consolas" w:hAnsi="Consolas"/>
+          <w:color w:val="6CB8E6"/>
+        </w:rPr>
+        <w:t>View</w:t>
+      </w:r>
+      <w:r>
+        <w:rPr>
+          <w:rStyle w:val="token"/>
+          <w:rFonts w:ascii="Consolas" w:hAnsi="Consolas"/>
+          <w:color w:val="66CCCC"/>
+        </w:rPr>
+        <w:t xml:space="preserve"> </w:t>
+      </w:r>
+      <w:r>
+        <w:rPr>
+          <w:rStyle w:val="token"/>
+          <w:rFonts w:ascii="Consolas" w:hAnsi="Consolas"/>
+          <w:color w:val="E6D37A"/>
+        </w:rPr>
+        <w:t>style</w:t>
+      </w:r>
+      <w:r>
+        <w:rPr>
+          <w:rStyle w:val="token"/>
+          <w:rFonts w:ascii="Consolas" w:hAnsi="Consolas"/>
+          <w:color w:val="66CCCC"/>
+        </w:rPr>
+        <w:t>={{ flex</w:t>
+      </w:r>
+      <w:r>
+        <w:rPr>
+          <w:rStyle w:val="token"/>
+          <w:rFonts w:ascii="Consolas" w:hAnsi="Consolas"/>
+          <w:color w:val="E9AE7E"/>
+        </w:rPr>
+        <w:t>:</w:t>
+      </w:r>
+      <w:r>
+        <w:rPr>
+          <w:rStyle w:val="token"/>
+          <w:rFonts w:ascii="Consolas" w:hAnsi="Consolas"/>
+          <w:color w:val="66CCCC"/>
+        </w:rPr>
+        <w:t xml:space="preserve"> </w:t>
+      </w:r>
+      <w:r>
+        <w:rPr>
+          <w:rStyle w:val="token"/>
+          <w:rFonts w:ascii="Consolas" w:hAnsi="Consolas"/>
+          <w:color w:val="E6D37A"/>
+        </w:rPr>
+        <w:t>2</w:t>
+      </w:r>
+      <w:r>
+        <w:rPr>
+          <w:rStyle w:val="token"/>
+          <w:rFonts w:ascii="Consolas" w:hAnsi="Consolas"/>
+          <w:color w:val="66CCCC"/>
+        </w:rPr>
+        <w:t xml:space="preserve"> }}&gt;</w:t>
+      </w:r>
+      <w:r>
+        <w:rPr>
+          <w:rStyle w:val="token"/>
+          <w:rFonts w:ascii="Consolas" w:hAnsi="Consolas"/>
+          <w:color w:val="F9FAFB"/>
+        </w:rPr>
+        <w:t>Cột phải</w:t>
+      </w:r>
+      <w:r>
+        <w:rPr>
+          <w:rStyle w:val="token"/>
+          <w:rFonts w:ascii="Consolas" w:hAnsi="Consolas"/>
+          <w:color w:val="66CCCC"/>
+        </w:rPr>
+        <w:t>&lt;/</w:t>
+      </w:r>
+      <w:r>
+        <w:rPr>
+          <w:rStyle w:val="token"/>
+          <w:rFonts w:ascii="Consolas" w:hAnsi="Consolas"/>
+          <w:color w:val="6CB8E6"/>
+        </w:rPr>
+        <w:t>View</w:t>
+      </w:r>
+      <w:r>
+        <w:rPr>
+          <w:rStyle w:val="token"/>
+          <w:rFonts w:ascii="Consolas" w:hAnsi="Consolas"/>
+          <w:color w:val="66CCCC"/>
+        </w:rPr>
+        <w:t>&gt;</w:t>
+      </w:r>
+      <w:r>
+        <w:rPr>
+          <w:rStyle w:val="token"/>
+          <w:rFonts w:ascii="Consolas" w:hAnsi="Consolas"/>
+          <w:color w:val="F9FAFB"/>
+        </w:rPr>
+        <w:t xml:space="preserve">   // ← gấp đôi</w:t>
+      </w:r>
+    </w:p>
+    <w:p>
+      <w:pPr>
+        <w:pStyle w:val="HTMLPreformatted"/>
+        <w:wordWrap w:val="0"/>
+        <w:spacing w:line="330" w:lineRule="atLeast"/>
+        <w:rPr>
+          <w:rFonts w:ascii="Consolas" w:hAnsi="Consolas"/>
+          <w:color w:val="F9FAFB"/>
+        </w:rPr>
+      </w:pPr>
+      <w:r>
+        <w:rPr>
+          <w:rStyle w:val="token"/>
+          <w:rFonts w:ascii="Consolas" w:hAnsi="Consolas"/>
+          <w:color w:val="66CCCC"/>
+        </w:rPr>
+        <w:t>&lt;/</w:t>
+      </w:r>
+      <w:r>
+        <w:rPr>
+          <w:rStyle w:val="token"/>
+          <w:rFonts w:ascii="Consolas" w:hAnsi="Consolas"/>
+          <w:color w:val="6CB8E6"/>
+        </w:rPr>
+        <w:t>View</w:t>
+      </w:r>
+      <w:r>
+        <w:rPr>
+          <w:rStyle w:val="token"/>
+          <w:rFonts w:ascii="Consolas" w:hAnsi="Consolas"/>
+          <w:color w:val="66CCCC"/>
+        </w:rPr>
+        <w:t>&gt;</w:t>
+      </w:r>
+    </w:p>
+    <w:p>
+      <w:pPr>
+        <w:pStyle w:val="ds-markdown-paragraph"/>
+        <w:shd w:val="clear" w:color="auto" w:fill="151517"/>
+        <w:spacing w:before="240" w:beforeAutospacing="0" w:after="240" w:afterAutospacing="0"/>
+        <w:rPr>
+          <w:rFonts w:ascii="Segoe UI" w:hAnsi="Segoe UI" w:cs="Segoe UI"/>
+          <w:color w:val="F9FAFB"/>
+        </w:rPr>
+      </w:pPr>
+      <w:r>
+        <w:rPr>
+          <w:rFonts w:ascii="Segoe UI" w:hAnsi="Segoe UI" w:cs="Segoe UI"/>
+          <w:color w:val="F9FAFB"/>
+        </w:rPr>
+        <w:t xml:space="preserve">→ </w:t>
+      </w:r>
+      <w:r>
+        <w:rPr>
+          <w:rStyle w:val="HTMLCode"/>
+          <w:rFonts w:ascii="Consolas" w:hAnsi="Consolas"/>
+          <w:color w:val="F9FAFB"/>
+          <w:shd w:val="clear" w:color="auto" w:fill="2C2C2E"/>
+        </w:rPr>
+        <w:t>flex: 1</w:t>
+      </w:r>
+      <w:r>
+        <w:rPr>
+          <w:rFonts w:ascii="Segoe UI" w:hAnsi="Segoe UI" w:cs="Segoe UI"/>
+          <w:color w:val="F9FAFB"/>
+        </w:rPr>
+        <w:t xml:space="preserve"> vs </w:t>
+      </w:r>
+      <w:r>
+        <w:rPr>
+          <w:rStyle w:val="HTMLCode"/>
+          <w:rFonts w:ascii="Consolas" w:hAnsi="Consolas"/>
+          <w:color w:val="F9FAFB"/>
+          <w:shd w:val="clear" w:color="auto" w:fill="2C2C2E"/>
+        </w:rPr>
+        <w:t>flex: 2</w:t>
+      </w:r>
+      <w:r>
+        <w:rPr>
+          <w:rFonts w:ascii="Segoe UI" w:hAnsi="Segoe UI" w:cs="Segoe UI"/>
+          <w:color w:val="F9FAFB"/>
+        </w:rPr>
+        <w:t xml:space="preserve"> → cột phải rộng gấp đôi cột trái.</w:t>
+      </w:r>
+    </w:p>
+    <w:p>
+      <w:pPr>
+        <w:rPr>
+          <w:lang w:val="vi-VN"/>
+        </w:rPr>
+      </w:pPr>
+    </w:p>
+    <w:p>
+      <w:r>
+        <w:rPr>
+          <w:noProof/>
+        </w:rPr>
+        <w:lastRenderedPageBreak/>
+        <w:drawing>
+          <wp:inline distT="0" distB="0" distL="0" distR="0" wp14:anchorId="4220671C" wp14:editId="27BF0EA9">
+            <wp:extent cx="5943600" cy="3625886"/>
+            <wp:effectExtent l="0" t="0" r="0" b="0"/>
+            <wp:docPr id="2" name="Picture 2"/>
+            <wp:cNvGraphicFramePr>
+              <a:graphicFrameLocks xmlns:a="http://schemas.openxmlformats.org/drawingml/2006/main" noChangeAspect="1"/>
+            </wp:cNvGraphicFramePr>
+            <a:graphic xmlns:a="http://schemas.openxmlformats.org/drawingml/2006/main">
+              <a:graphicData uri="http://schemas.openxmlformats.org/drawingml/2006/picture">
+                <pic:pic xmlns:pic="http://schemas.openxmlformats.org/drawingml/2006/picture">
+                  <pic:nvPicPr>
+                    <pic:cNvPr id="1" name=""/>
+                    <pic:cNvPicPr/>
+                  </pic:nvPicPr>
+                  <pic:blipFill>
+                    <a:blip r:embed="rId11"/>
+                    <a:stretch>
+                      <a:fillRect/>
+                    </a:stretch>
+                  </pic:blipFill>
+                  <pic:spPr>
+                    <a:xfrm>
+                      <a:off x="0" y="0"/>
+                      <a:ext cx="5948396" cy="3628812"/>
+                    </a:xfrm>
+                    <a:prstGeom prst="rect">
+                      <a:avLst/>
+                    </a:prstGeom>
+                  </pic:spPr>
+                </pic:pic>
+              </a:graphicData>
+            </a:graphic>
+          </wp:inline>
+        </w:drawing>
+      </w:r>
+    </w:p>
+    <w:p>
+      <w:pPr>
+        <w:rPr>
+          <w:lang w:val="vi-VN"/>
+        </w:rPr>
+      </w:pPr>
+      <w:r>
+        <w:rPr>
+          <w:lang w:val="vi-VN"/>
+        </w:rPr>
+        <w:t>Dùng Switch để đổi loại cột phải nhớ thêm KEY ko là bị lỗi</w:t>
+      </w:r>
+    </w:p>
+    <w:p>
+      <w:r>
+        <w:rPr>
+          <w:noProof/>
+        </w:rPr>
+        <w:drawing>
+          <wp:inline distT="0" distB="0" distL="0" distR="0" wp14:anchorId="7CAAB060" wp14:editId="6285E68A">
+            <wp:extent cx="5943600" cy="716915"/>
+            <wp:effectExtent l="0" t="0" r="0" b="6985"/>
+            <wp:docPr id="3" name="Picture 3"/>
+            <wp:cNvGraphicFramePr>
+              <a:graphicFrameLocks xmlns:a="http://schemas.openxmlformats.org/drawingml/2006/main" noChangeAspect="1"/>
+            </wp:cNvGraphicFramePr>
+            <a:graphic xmlns:a="http://schemas.openxmlformats.org/drawingml/2006/main">
+              <a:graphicData uri="http://schemas.openxmlformats.org/drawingml/2006/picture">
+                <pic:pic xmlns:pic="http://schemas.openxmlformats.org/drawingml/2006/picture">
+                  <pic:nvPicPr>
+                    <pic:cNvPr id="1" name=""/>
+                    <pic:cNvPicPr/>
+                  </pic:nvPicPr>
+                  <pic:blipFill>
+                    <a:blip r:embed="rId12"/>
+                    <a:stretch>
+                      <a:fillRect/>
+                    </a:stretch>
+                  </pic:blipFill>
+                  <pic:spPr>
+                    <a:xfrm>
+                      <a:off x="0" y="0"/>
+                      <a:ext cx="5943600" cy="716915"/>
+                    </a:xfrm>
+                    <a:prstGeom prst="rect">
+                      <a:avLst/>
+                    </a:prstGeom>
+                  </pic:spPr>
+                </pic:pic>
+              </a:graphicData>
+            </a:graphic>
+          </wp:inline>
+        </w:drawing>
+      </w:r>
+    </w:p>
+    <w:p/>
+    <w:p>
+      <w:pPr>
+        <w:rPr>
+          <w:lang w:val="vi-VN"/>
+        </w:rPr>
+      </w:pPr>
+      <w:r>
+        <w:rPr>
+          <w:lang w:val="vi-VN"/>
+        </w:rPr>
+        <w:t xml:space="preserve">Css kết hợp inline với styleSheet phải cho vô mảng </w:t>
+      </w:r>
+    </w:p>
+    <w:p>
+      <w:pPr>
+        <w:rPr>
+          <w:lang w:val="vi-VN"/>
+        </w:rPr>
+      </w:pPr>
+      <w:r>
+        <w:rPr>
+          <w:noProof/>
+        </w:rPr>
+        <w:drawing>
+          <wp:inline distT="0" distB="0" distL="0" distR="0" wp14:anchorId="2843F9B1" wp14:editId="40CA6C1B">
+            <wp:extent cx="5943600" cy="170180"/>
+            <wp:effectExtent l="0" t="0" r="0" b="1270"/>
+            <wp:docPr id="4" name="Picture 4"/>
+            <wp:cNvGraphicFramePr>
+              <a:graphicFrameLocks xmlns:a="http://schemas.openxmlformats.org/drawingml/2006/main" noChangeAspect="1"/>
+            </wp:cNvGraphicFramePr>
+            <a:graphic xmlns:a="http://schemas.openxmlformats.org/drawingml/2006/main">
+              <a:graphicData uri="http://schemas.openxmlformats.org/drawingml/2006/picture">
+                <pic:pic xmlns:pic="http://schemas.openxmlformats.org/drawingml/2006/picture">
+                  <pic:nvPicPr>
+                    <pic:cNvPr id="1" name=""/>
+                    <pic:cNvPicPr/>
+                  </pic:nvPicPr>
+                  <pic:blipFill>
+                    <a:blip r:embed="rId13"/>
+                    <a:stretch>
+                      <a:fillRect/>
+                    </a:stretch>
+                  </pic:blipFill>
+                  <pic:spPr>
+                    <a:xfrm>
+                      <a:off x="0" y="0"/>
+                      <a:ext cx="5943600" cy="170180"/>
+                    </a:xfrm>
+                    <a:prstGeom prst="rect">
+                      <a:avLst/>
+                    </a:prstGeom>
+                  </pic:spPr>
+                </pic:pic>
+              </a:graphicData>
+            </a:graphic>
+          </wp:inline>
+        </w:drawing>
+      </w:r>
+    </w:p>
+    <w:p>
+      <w:pPr>
+        <w:rPr>
+          <w:lang w:val="vi-VN"/>
+        </w:rPr>
+      </w:pPr>
+      <w:r>
+        <w:rPr>
+          <w:lang w:val="vi-VN"/>
+        </w:rPr>
+        <w:t>* CÓ thể lọc trong mảng bằng filter, rồi cho dsXeHT vô trong data của FlatList</w:t>
+      </w:r>
+      <w:r>
+        <w:rPr>
+          <w:noProof/>
+        </w:rPr>
+        <w:drawing>
+          <wp:inline distT="0" distB="0" distL="0" distR="0" wp14:anchorId="5701F5CD" wp14:editId="7FB28DD8">
+            <wp:extent cx="5819818" cy="762006"/>
+            <wp:effectExtent l="0" t="0" r="0" b="0"/>
+            <wp:docPr id="5" name="Picture 5"/>
+            <wp:cNvGraphicFramePr>
+              <a:graphicFrameLocks xmlns:a="http://schemas.openxmlformats.org/drawingml/2006/main" noChangeAspect="1"/>
+            </wp:cNvGraphicFramePr>
+            <a:graphic xmlns:a="http://schemas.openxmlformats.org/drawingml/2006/main">
+              <a:graphicData uri="http://schemas.openxmlformats.org/drawingml/2006/picture">
+                <pic:pic xmlns:pic="http://schemas.openxmlformats.org/drawingml/2006/picture">
+                  <pic:nvPicPr>
+                    <pic:cNvPr id="1" name=""/>
+                    <pic:cNvPicPr/>
+                  </pic:nvPicPr>
+                  <pic:blipFill>
+                    <a:blip r:embed="rId14"/>
+                    <a:stretch>
+                      <a:fillRect/>
+                    </a:stretch>
+                  </pic:blipFill>
+                  <pic:spPr>
+                    <a:xfrm>
+                      <a:off x="0" y="0"/>
                       <a:ext cx="5819818" cy="762006"/>
                     </a:xfrm>
                     <a:prstGeom prst="rect">
@@ -314,6 +2621,66 @@
         </w:drawing>
       </w:r>
     </w:p>
+    <w:p>
+      <w:pPr>
+        <w:rPr>
+          <w:lang w:val="vi-VN"/>
+        </w:rPr>
+      </w:pPr>
+      <w:r>
+        <w:rPr>
+          <w:lang w:val="vi-VN"/>
+        </w:rPr>
+        <w:t>colWr</w:t>
+      </w:r>
+    </w:p>
+    <w:p>
+      <w:pPr>
+        <w:rPr>
+          <w:lang w:val="vi-VN"/>
+        </w:rPr>
+      </w:pPr>
+      <w:r>
+        <w:rPr>
+          <w:noProof/>
+        </w:rPr>
+        <w:drawing>
+          <wp:inline distT="0" distB="0" distL="0" distR="0" wp14:anchorId="7FEF18B1" wp14:editId="22F07559">
+            <wp:extent cx="5943600" cy="281940"/>
+            <wp:effectExtent l="0" t="0" r="0" b="3810"/>
+            <wp:docPr id="9" name="Picture 9"/>
+            <wp:cNvGraphicFramePr>
+              <a:graphicFrameLocks xmlns:a="http://schemas.openxmlformats.org/drawingml/2006/main" noChangeAspect="1"/>
+            </wp:cNvGraphicFramePr>
+            <a:graphic xmlns:a="http://schemas.openxmlformats.org/drawingml/2006/main">
+              <a:graphicData uri="http://schemas.openxmlformats.org/drawingml/2006/picture">
+                <pic:pic xmlns:pic="http://schemas.openxmlformats.org/drawingml/2006/picture">
+                  <pic:nvPicPr>
+                    <pic:cNvPr id="1" name=""/>
+                    <pic:cNvPicPr/>
+                  </pic:nvPicPr>
+                  <pic:blipFill>
+                    <a:blip r:embed="rId15"/>
+                    <a:stretch>
+                      <a:fillRect/>
+                    </a:stretch>
+                  </pic:blipFill>
+                  <pic:spPr>
+                    <a:xfrm>
+                      <a:off x="0" y="0"/>
+                      <a:ext cx="5943600" cy="281940"/>
+                    </a:xfrm>
+                    <a:prstGeom prst="rect">
+                      <a:avLst/>
+                    </a:prstGeom>
+                  </pic:spPr>
+                </pic:pic>
+              </a:graphicData>
+            </a:graphic>
+          </wp:inline>
+        </w:drawing>
+      </w:r>
+    </w:p>
     <w:p/>
     <w:p>
       <w:pPr>
@@ -337,6 +2704,7 @@
           <w:sz w:val="48"/>
           <w:szCs w:val="48"/>
         </w:rPr>
+        <w:lastRenderedPageBreak/>
         <w:t>⭐</w:t>
       </w:r>
       <w:r>
@@ -809,7 +3177,6 @@
           <w:sz w:val="20"/>
           <w:szCs w:val="20"/>
         </w:rPr>
-        <w:lastRenderedPageBreak/>
         <w:t>center</w:t>
       </w:r>
     </w:p>
@@ -1087,6 +3454,7 @@
           <w:sz w:val="24"/>
           <w:szCs w:val="24"/>
         </w:rPr>
+        <w:lastRenderedPageBreak/>
         <w:t>→ căn giữa theo trục phụ.</w:t>
       </w:r>
     </w:p>
@@ -1606,7 +3974,6 @@
           <w:sz w:val="24"/>
           <w:szCs w:val="24"/>
         </w:rPr>
-        <w:lastRenderedPageBreak/>
         <w:pict>
           <v:rect id="_x0000_i1033" style="width:0;height:1.5pt" o:hralign="center" o:hrstd="t" o:hr="t" fillcolor="#a0a0a0" stroked="f"/>
         </w:pict>
@@ -1794,6 +4161,7 @@
           <w:sz w:val="24"/>
           <w:szCs w:val="24"/>
         </w:rPr>
+        <w:lastRenderedPageBreak/>
         <w:t>Kết hợp:</w:t>
       </w:r>
     </w:p>
@@ -2463,7 +4831,6 @@
           <w:sz w:val="20"/>
           <w:szCs w:val="20"/>
         </w:rPr>
-        <w:lastRenderedPageBreak/>
         <w:t>flexDirection: 'row'</w:t>
       </w:r>
     </w:p>
@@ -2651,6 +5018,7 @@
           <w:sz w:val="20"/>
           <w:szCs w:val="20"/>
         </w:rPr>
+        <w:lastRenderedPageBreak/>
         <w:t>flexDirection: 'row'</w:t>
       </w:r>
     </w:p>
@@ -3122,7 +5490,6 @@
           <w:sz w:val="24"/>
           <w:szCs w:val="24"/>
         </w:rPr>
-        <w:lastRenderedPageBreak/>
         <w:t>Tạo khoảng cách</w:t>
       </w:r>
     </w:p>
@@ -3343,6 +5710,7 @@
           <w:sz w:val="20"/>
           <w:szCs w:val="20"/>
         </w:rPr>
+        <w:lastRenderedPageBreak/>
         <w:t>badge: absolute</w:t>
       </w:r>
     </w:p>
@@ -3651,6 +6019,163 @@
     </w:sectPr>
   </w:body>
 </w:document>
+</file>
+
+<file path=word/numbering.xml><?xml version="1.0" encoding="utf-8"?>
+<w:numbering xmlns:wpc="http://schemas.microsoft.com/office/word/2010/wordprocessingCanvas" xmlns:cx="http://schemas.microsoft.com/office/drawing/2014/chartex" xmlns:mc="http://schemas.openxmlformats.org/markup-compatibility/2006" xmlns:o="urn:schemas-microsoft-com:office:office" xmlns:r="http://schemas.openxmlformats.org/officeDocument/2006/relationships" xmlns:m="http://schemas.openxmlformats.org/officeDocument/2006/math" xmlns:v="urn:schemas-microsoft-com:vml" xmlns:wp14="http://schemas.microsoft.com/office/word/2010/wordprocessingDrawing" xmlns:wp="http://schemas.openxmlformats.org/drawingml/2006/wordprocessingDrawing" xmlns:w10="urn:schemas-microsoft-com:office:word" xmlns:w="http://schemas.openxmlformats.org/wordprocessingml/2006/main" xmlns:w14="http://schemas.microsoft.com/office/word/2010/wordml" xmlns:w15="http://schemas.microsoft.com/office/word/2012/wordml" xmlns:w16se="http://schemas.microsoft.com/office/word/2015/wordml/symex" xmlns:wpg="http://schemas.microsoft.com/office/word/2010/wordprocessingGroup" xmlns:wpi="http://schemas.microsoft.com/office/word/2010/wordprocessingInk" xmlns:wne="http://schemas.microsoft.com/office/word/2006/wordml" xmlns:wps="http://schemas.microsoft.com/office/word/2010/wordprocessingShape" mc:Ignorable="w14 w15 w16se wp14">
+  <w:abstractNum w:abstractNumId="0" w15:restartNumberingAfterBreak="0">
+    <w:nsid w:val="3F735E3B"/>
+    <w:multiLevelType w:val="multilevel"/>
+    <w:tmpl w:val="947261F6"/>
+    <w:lvl w:ilvl="0">
+      <w:start w:val="1"/>
+      <w:numFmt w:val="bullet"/>
+      <w:lvlText w:val=""/>
+      <w:lvlJc w:val="left"/>
+      <w:pPr>
+        <w:tabs>
+          <w:tab w:val="num" w:pos="720"/>
+        </w:tabs>
+        <w:ind w:left="720" w:hanging="360"/>
+      </w:pPr>
+      <w:rPr>
+        <w:rFonts w:ascii="Symbol" w:hAnsi="Symbol" w:hint="default"/>
+        <w:sz w:val="20"/>
+      </w:rPr>
+    </w:lvl>
+    <w:lvl w:ilvl="1" w:tentative="1">
+      <w:start w:val="1"/>
+      <w:numFmt w:val="bullet"/>
+      <w:lvlText w:val="o"/>
+      <w:lvlJc w:val="left"/>
+      <w:pPr>
+        <w:tabs>
+          <w:tab w:val="num" w:pos="1440"/>
+        </w:tabs>
+        <w:ind w:left="1440" w:hanging="360"/>
+      </w:pPr>
+      <w:rPr>
+        <w:rFonts w:ascii="Courier New" w:hAnsi="Courier New" w:hint="default"/>
+        <w:sz w:val="20"/>
+      </w:rPr>
+    </w:lvl>
+    <w:lvl w:ilvl="2" w:tentative="1">
+      <w:start w:val="1"/>
+      <w:numFmt w:val="bullet"/>
+      <w:lvlText w:val=""/>
+      <w:lvlJc w:val="left"/>
+      <w:pPr>
+        <w:tabs>
+          <w:tab w:val="num" w:pos="2160"/>
+        </w:tabs>
+        <w:ind w:left="2160" w:hanging="360"/>
+      </w:pPr>
+      <w:rPr>
+        <w:rFonts w:ascii="Wingdings" w:hAnsi="Wingdings" w:hint="default"/>
+        <w:sz w:val="20"/>
+      </w:rPr>
+    </w:lvl>
+    <w:lvl w:ilvl="3" w:tentative="1">
+      <w:start w:val="1"/>
+      <w:numFmt w:val="bullet"/>
+      <w:lvlText w:val=""/>
+      <w:lvlJc w:val="left"/>
+      <w:pPr>
+        <w:tabs>
+          <w:tab w:val="num" w:pos="2880"/>
+        </w:tabs>
+        <w:ind w:left="2880" w:hanging="360"/>
+      </w:pPr>
+      <w:rPr>
+        <w:rFonts w:ascii="Wingdings" w:hAnsi="Wingdings" w:hint="default"/>
+        <w:sz w:val="20"/>
+      </w:rPr>
+    </w:lvl>
+    <w:lvl w:ilvl="4" w:tentative="1">
+      <w:start w:val="1"/>
+      <w:numFmt w:val="bullet"/>
+      <w:lvlText w:val=""/>
+      <w:lvlJc w:val="left"/>
+      <w:pPr>
+        <w:tabs>
+          <w:tab w:val="num" w:pos="3600"/>
+        </w:tabs>
+        <w:ind w:left="3600" w:hanging="360"/>
+      </w:pPr>
+      <w:rPr>
+        <w:rFonts w:ascii="Wingdings" w:hAnsi="Wingdings" w:hint="default"/>
+        <w:sz w:val="20"/>
+      </w:rPr>
+    </w:lvl>
+    <w:lvl w:ilvl="5" w:tentative="1">
+      <w:start w:val="1"/>
+      <w:numFmt w:val="bullet"/>
+      <w:lvlText w:val=""/>
+      <w:lvlJc w:val="left"/>
+      <w:pPr>
+        <w:tabs>
+          <w:tab w:val="num" w:pos="4320"/>
+        </w:tabs>
+        <w:ind w:left="4320" w:hanging="360"/>
+      </w:pPr>
+      <w:rPr>
+        <w:rFonts w:ascii="Wingdings" w:hAnsi="Wingdings" w:hint="default"/>
+        <w:sz w:val="20"/>
+      </w:rPr>
+    </w:lvl>
+    <w:lvl w:ilvl="6" w:tentative="1">
+      <w:start w:val="1"/>
+      <w:numFmt w:val="bullet"/>
+      <w:lvlText w:val=""/>
+      <w:lvlJc w:val="left"/>
+      <w:pPr>
+        <w:tabs>
+          <w:tab w:val="num" w:pos="5040"/>
+        </w:tabs>
+        <w:ind w:left="5040" w:hanging="360"/>
+      </w:pPr>
+      <w:rPr>
+        <w:rFonts w:ascii="Wingdings" w:hAnsi="Wingdings" w:hint="default"/>
+        <w:sz w:val="20"/>
+      </w:rPr>
+    </w:lvl>
+    <w:lvl w:ilvl="7" w:tentative="1">
+      <w:start w:val="1"/>
+      <w:numFmt w:val="bullet"/>
+      <w:lvlText w:val=""/>
+      <w:lvlJc w:val="left"/>
+      <w:pPr>
+        <w:tabs>
+          <w:tab w:val="num" w:pos="5760"/>
+        </w:tabs>
+        <w:ind w:left="5760" w:hanging="360"/>
+      </w:pPr>
+      <w:rPr>
+        <w:rFonts w:ascii="Wingdings" w:hAnsi="Wingdings" w:hint="default"/>
+        <w:sz w:val="20"/>
+      </w:rPr>
+    </w:lvl>
+    <w:lvl w:ilvl="8" w:tentative="1">
+      <w:start w:val="1"/>
+      <w:numFmt w:val="bullet"/>
+      <w:lvlText w:val=""/>
+      <w:lvlJc w:val="left"/>
+      <w:pPr>
+        <w:tabs>
+          <w:tab w:val="num" w:pos="6480"/>
+        </w:tabs>
+        <w:ind w:left="6480" w:hanging="360"/>
+      </w:pPr>
+      <w:rPr>
+        <w:rFonts w:ascii="Wingdings" w:hAnsi="Wingdings" w:hint="default"/>
+        <w:sz w:val="20"/>
+      </w:rPr>
+    </w:lvl>
+  </w:abstractNum>
+  <w:num w:numId="1">
+    <w:abstractNumId w:val="0"/>
+  </w:num>
+</w:numbering>
 </file>
 
 <file path=word/styles.xml><?xml version="1.0" encoding="utf-8"?>
@@ -4260,6 +6785,57 @@
     <w:basedOn w:val="DefaultParagraphFont"/>
     <w:rsid w:val="007179EF"/>
   </w:style>
+  <w:style w:type="character" w:customStyle="1" w:styleId="d813de27">
+    <w:name w:val="d813de27"/>
+    <w:basedOn w:val="DefaultParagraphFont"/>
+    <w:rsid w:val="006C3082"/>
+  </w:style>
+  <w:style w:type="paragraph" w:customStyle="1" w:styleId="ds-markdown-paragraph">
+    <w:name w:val="ds-markdown-paragraph"/>
+    <w:basedOn w:val="Normal"/>
+    <w:rsid w:val="006C3082"/>
+    <w:pPr>
+      <w:spacing w:before="100" w:beforeAutospacing="1" w:after="100" w:afterAutospacing="1" w:line="240" w:lineRule="auto"/>
+    </w:pPr>
+    <w:rPr>
+      <w:rFonts w:ascii="Times New Roman" w:eastAsia="Times New Roman" w:hAnsi="Times New Roman" w:cs="Times New Roman"/>
+      <w:sz w:val="24"/>
+      <w:szCs w:val="24"/>
+    </w:rPr>
+  </w:style>
+  <w:style w:type="paragraph" w:customStyle="1" w:styleId="w6asjqtextbase">
+    <w:name w:val="w6asjq_textbase"/>
+    <w:basedOn w:val="Normal"/>
+    <w:rsid w:val="0016002E"/>
+    <w:pPr>
+      <w:spacing w:before="100" w:beforeAutospacing="1" w:after="100" w:afterAutospacing="1" w:line="240" w:lineRule="auto"/>
+    </w:pPr>
+    <w:rPr>
+      <w:rFonts w:ascii="Times New Roman" w:eastAsia="Times New Roman" w:hAnsi="Times New Roman" w:cs="Times New Roman"/>
+      <w:sz w:val="24"/>
+      <w:szCs w:val="24"/>
+    </w:rPr>
+  </w:style>
+  <w:style w:type="character" w:customStyle="1" w:styleId="w6asjqtextbase1">
+    <w:name w:val="w6asjq_textbase1"/>
+    <w:basedOn w:val="DefaultParagraphFont"/>
+    <w:rsid w:val="0016002E"/>
+  </w:style>
+  <w:style w:type="character" w:customStyle="1" w:styleId="oib9lqbox">
+    <w:name w:val="oib9lq_box"/>
+    <w:basedOn w:val="DefaultParagraphFont"/>
+    <w:rsid w:val="0016002E"/>
+  </w:style>
+  <w:style w:type="character" w:customStyle="1" w:styleId="s">
+    <w:name w:val="ͼs"/>
+    <w:basedOn w:val="DefaultParagraphFont"/>
+    <w:rsid w:val="0016002E"/>
+  </w:style>
+  <w:style w:type="character" w:customStyle="1" w:styleId="u">
+    <w:name w:val="ͼu"/>
+    <w:basedOn w:val="DefaultParagraphFont"/>
+    <w:rsid w:val="0016002E"/>
+  </w:style>
 </w:styles>
 </file>
 

</xml_diff>